<commit_message>
Update Indonesian documentation to match English version
Update the Indonesian documentation to mirror the English version by incorporating new sections and a glossary of terms.

Replit-Commit-Author: Agent
Replit-Commit-Session-Id: 0226671d-4d7c-40eb-9b18-8775578e8874
Replit-Commit-Checkpoint-Type: full_checkpoint
Replit-Commit-Event-Id: b0f736c7-f70e-4b74-9d2c-e4438975460b
Replit-Commit-Screenshot-Url: https://storage.googleapis.com/screenshot-production-us-central1/c82b66a8-f4a7-47f1-bdbd-9ebba5cc2312/0226671d-4d7c-40eb-9b18-8775578e8874/JiEOTRE
Replit-Helium-Checkpoint-Created: true
</commit_message>
<xml_diff>
--- a/exports/SecureProfit-Hub-Fitur-dan-Perhitungan.docx
+++ b/exports/SecureProfit-Hub-Fitur-dan-Perhitungan.docx
@@ -2417,7 +2417,7 @@
           <w:sz w:val="22"/>
           <w:szCs w:val="22"/>
         </w:rPr>
-        <w:t xml:space="preserve">biaya, profit, margin, burn rate, dan proyeksi (forecast).</w:t>
+        <w:t>biaya, profit, margin, burn rate, proyeksi (forecast), serta panel Profit Outlook (apakah project ini akan untung?) dan skor Project Health.</w:t>
       </w:r>
     </w:p>
     <w:p>
@@ -3772,7 +3772,7 @@
           <w:sz w:val="26"/>
           <w:szCs w:val="26"/>
         </w:rPr>
-        <w:t xml:space="preserve">6.11 Rekap PPN (VAT Recap)</w:t>
+        <w:t>6.11 Profit Outlook (Apakah Project Ini Akan Untung?)</w:t>
       </w:r>
     </w:p>
     <w:p>
@@ -3784,7 +3784,305 @@
           <w:sz w:val="22"/>
           <w:szCs w:val="22"/>
         </w:rPr>
-        <w:t xml:space="preserve">Rekap PPN menjumlahkan seluruh invoice berstatus INVOICED dan PAID ke dalam rincian 12 bulan + total tahunan, untuk kebutuhan pelaporan pajak.</w:t>
+        <w:t>Profit Outlook menjawab, dalam bahasa sederhana, “apakah project ini akan menghasilkan keuntungan?” tanpa harus menunggu project selesai. Panel ini membandingkan tiga snapshot berdampingan, masing-masing ditampilkan sebagai nilai untung/rugi dalam Rupiah beserta persentase margin:</w:t>
+      </w:r>
+    </w:p>
+    <w:p>
+      <w:pPr>
+        <w:pStyle w:val="ListParagraph"/>
+        <w:numPr>
+          <w:ilvl w:val="0"/>
+          <w:numId w:val="1"/>
+        </w:numPr>
+        <w:spacing w:after="60" w:line="268"/>
+      </w:pPr>
+      <w:r>
+        <w:rPr>
+          <w:b/>
+          <w:bCs/>
+          <w:sz w:val="22"/>
+          <w:szCs w:val="22"/>
+        </w:rPr>
+        <w:t xml:space="preserve">Estimasi Awal — </w:t>
+      </w:r>
+      <w:r>
+        <w:rPr>
+          <w:b w:val="false"/>
+          <w:bCs w:val="false"/>
+          <w:sz w:val="22"/>
+          <w:szCs w:val="22"/>
+        </w:rPr>
+        <w:t>rencana yang dicatat saat intake (nilai kontrak dikurangi estimasi biaya).</w:t>
+      </w:r>
+    </w:p>
+    <w:p>
+      <w:pPr>
+        <w:pStyle w:val="ListParagraph"/>
+        <w:numPr>
+          <w:ilvl w:val="0"/>
+          <w:numId w:val="1"/>
+        </w:numPr>
+        <w:spacing w:after="60" w:line="268"/>
+      </w:pPr>
+      <w:r>
+        <w:rPr>
+          <w:b/>
+          <w:bCs/>
+          <w:sz w:val="22"/>
+          <w:szCs w:val="22"/>
+        </w:rPr>
+        <w:t xml:space="preserve">Aktual (sejauh ini) — </w:t>
+      </w:r>
+      <w:r>
+        <w:rPr>
+          <w:b w:val="false"/>
+          <w:bCs w:val="false"/>
+          <w:sz w:val="22"/>
+          <w:szCs w:val="22"/>
+        </w:rPr>
+        <w:t>hasil memakai hanya biaya yang sudah disetujui sampai saat ini (nilai kontrak dikurangi actualCost).</w:t>
+      </w:r>
+    </w:p>
+    <w:p>
+      <w:pPr>
+        <w:pStyle w:val="ListParagraph"/>
+        <w:numPr>
+          <w:ilvl w:val="0"/>
+          <w:numId w:val="1"/>
+        </w:numPr>
+        <w:spacing w:after="60" w:line="268"/>
+      </w:pPr>
+      <w:r>
+        <w:rPr>
+          <w:b/>
+          <w:bCs/>
+          <w:sz w:val="22"/>
+          <w:szCs w:val="22"/>
+        </w:rPr>
+        <w:t xml:space="preserve">Proyeksi (akhir) — </w:t>
+      </w:r>
+      <w:r>
+        <w:rPr>
+          <w:b w:val="false"/>
+          <w:bCs w:val="false"/>
+          <w:sz w:val="22"/>
+          <w:szCs w:val="22"/>
+        </w:rPr>
+        <w:t>perkiraan saat selesai, dengan menskalakan laju pengeluaran saat ini ke seluruh manday yang direncanakan.</w:t>
+      </w:r>
+    </w:p>
+    <w:p>
+      <w:pPr>
+        <w:spacing w:after="120" w:line="276"/>
+      </w:pPr>
+      <w:r>
+        <w:rPr>
+          <w:sz w:val="22"/>
+          <w:szCs w:val="22"/>
+        </w:rPr>
+        <w:t>Angka proyeksi (akhir) diturunkan dari burn rate:</w:t>
+      </w:r>
+    </w:p>
+    <w:p>
+      <w:pPr>
+        <w:pBdr>
+          <w:left w:val="single" w:color="1F7A4D" w:sz="18" w:space="8"/>
+        </w:pBdr>
+        <w:shd w:fill="F1F6F2"/>
+        <w:spacing w:after="120" w:before="60"/>
+      </w:pPr>
+      <w:r>
+        <w:rPr>
+          <w:rFonts w:ascii="Consolas" w:cs="Consolas" w:eastAsia="Consolas" w:hAnsi="Consolas"/>
+          <w:color w:val="0F1B14"/>
+          <w:sz w:val="21"/>
+          <w:szCs w:val="21"/>
+        </w:rPr>
+        <w:t>avgDailyRate  = resourceCost ÷ actualMandays</w:t>
+      </w:r>
+    </w:p>
+    <w:p>
+      <w:pPr>
+        <w:pBdr>
+          <w:left w:val="single" w:color="1F7A4D" w:sz="18" w:space="8"/>
+        </w:pBdr>
+        <w:shd w:fill="F1F6F2"/>
+        <w:spacing w:after="120" w:before="60"/>
+      </w:pPr>
+      <w:r>
+        <w:rPr>
+          <w:rFonts w:ascii="Consolas" w:cs="Consolas" w:eastAsia="Consolas" w:hAnsi="Consolas"/>
+          <w:color w:val="0F1B14"/>
+          <w:sz w:val="21"/>
+          <w:szCs w:val="21"/>
+        </w:rPr>
+        <w:t>forecastCost  = max(plannedMandays, actualMandays) × avgDailyRate + additionalCost</w:t>
+      </w:r>
+    </w:p>
+    <w:p>
+      <w:pPr>
+        <w:pBdr>
+          <w:left w:val="single" w:color="1F7A4D" w:sz="18" w:space="8"/>
+        </w:pBdr>
+        <w:shd w:fill="F1F6F2"/>
+        <w:spacing w:after="120" w:before="60"/>
+      </w:pPr>
+      <w:r>
+        <w:rPr>
+          <w:rFonts w:ascii="Consolas" w:cs="Consolas" w:eastAsia="Consolas" w:hAnsi="Consolas"/>
+          <w:color w:val="0F1B14"/>
+          <w:sz w:val="21"/>
+          <w:szCs w:val="21"/>
+        </w:rPr>
+        <w:t>forecastProfit = contractValue − forecastCost</w:t>
+      </w:r>
+    </w:p>
+    <w:p>
+      <w:pPr>
+        <w:spacing w:after="120" w:line="276"/>
+      </w:pPr>
+      <w:r>
+        <w:rPr>
+          <w:sz w:val="22"/>
+          <w:szCs w:val="22"/>
+        </w:rPr>
+        <w:t>Sebuah badge status merangkum hasil yang diproyeksikan:</w:t>
+      </w:r>
+    </w:p>
+    <w:p>
+      <w:pPr>
+        <w:pStyle w:val="ListParagraph"/>
+        <w:numPr>
+          <w:ilvl w:val="0"/>
+          <w:numId w:val="1"/>
+        </w:numPr>
+        <w:spacing w:after="60" w:line="268"/>
+      </w:pPr>
+      <w:r>
+        <w:rPr>
+          <w:b/>
+          <w:bCs/>
+          <w:sz w:val="22"/>
+          <w:szCs w:val="22"/>
+        </w:rPr>
+        <w:t xml:space="preserve">On Track for Profit — </w:t>
+      </w:r>
+      <w:r>
+        <w:rPr>
+          <w:b w:val="false"/>
+          <w:bCs w:val="false"/>
+          <w:sz w:val="22"/>
+          <w:szCs w:val="22"/>
+        </w:rPr>
+        <w:t>margin akhir yang diproyeksikan sehat.</w:t>
+      </w:r>
+    </w:p>
+    <w:p>
+      <w:pPr>
+        <w:pStyle w:val="ListParagraph"/>
+        <w:numPr>
+          <w:ilvl w:val="0"/>
+          <w:numId w:val="1"/>
+        </w:numPr>
+        <w:spacing w:after="60" w:line="268"/>
+      </w:pPr>
+      <w:r>
+        <w:rPr>
+          <w:b/>
+          <w:bCs/>
+          <w:sz w:val="22"/>
+          <w:szCs w:val="22"/>
+        </w:rPr>
+        <w:t xml:space="preserve">Thin Margin — </w:t>
+      </w:r>
+      <w:r>
+        <w:rPr>
+          <w:b w:val="false"/>
+          <w:bCs w:val="false"/>
+          <w:sz w:val="22"/>
+          <w:szCs w:val="22"/>
+        </w:rPr>
+        <w:t>margin akhir yang diproyeksikan di bawah 10%.</w:t>
+      </w:r>
+    </w:p>
+    <w:p>
+      <w:pPr>
+        <w:pStyle w:val="ListParagraph"/>
+        <w:numPr>
+          <w:ilvl w:val="0"/>
+          <w:numId w:val="1"/>
+        </w:numPr>
+        <w:spacing w:after="60" w:line="268"/>
+      </w:pPr>
+      <w:r>
+        <w:rPr>
+          <w:b/>
+          <w:bCs/>
+          <w:sz w:val="22"/>
+          <w:szCs w:val="22"/>
+        </w:rPr>
+        <w:t xml:space="preserve">Loss Risk — </w:t>
+      </w:r>
+      <w:r>
+        <w:rPr>
+          <w:b w:val="false"/>
+          <w:bCs w:val="false"/>
+          <w:sz w:val="22"/>
+          <w:szCs w:val="22"/>
+        </w:rPr>
+        <w:t>biaya akhir yang diproyeksikan melebihi nilai kontrak (proyeksi rugi).</w:t>
+      </w:r>
+    </w:p>
+    <w:p>
+      <w:pPr>
+        <w:pStyle w:val="ListParagraph"/>
+        <w:numPr>
+          <w:ilvl w:val="0"/>
+          <w:numId w:val="1"/>
+        </w:numPr>
+        <w:spacing w:after="60" w:line="268"/>
+      </w:pPr>
+      <w:r>
+        <w:rPr>
+          <w:b/>
+          <w:bCs/>
+          <w:sz w:val="22"/>
+          <w:szCs w:val="22"/>
+        </w:rPr>
+        <w:t xml:space="preserve">Too Early to Tell — </w:t>
+      </w:r>
+      <w:r>
+        <w:rPr>
+          <w:b w:val="false"/>
+          <w:bCs w:val="false"/>
+          <w:sz w:val="22"/>
+          <w:szCs w:val="22"/>
+        </w:rPr>
+        <w:t>pekerjaan sudah dimulai tetapi kurang dari 20% manday yang direncanakan tercatat, sehingga proyeksi bertumpu pada sampel yang terlalu kecil untuk dipercaya. Putusan untung/rugi ditahan sampai lebih banyak pekerjaan tercatat.</w:t>
+      </w:r>
+    </w:p>
+    <w:p>
+      <w:pPr>
+        <w:spacing w:after="120" w:line="276"/>
+      </w:pPr>
+      <w:r>
+        <w:rPr>
+          <w:sz w:val="22"/>
+          <w:szCs w:val="22"/>
+        </w:rPr>
+        <w:t>Setiap proyeksi juga menyertakan keterangan seperti “Proyeksi berdasarkan laju pengeluaran saat ini · X% pekerjaan selesai”, sehingga selalu jelas bahwa angka tersebut adalah perkiraan dan berapa banyak pekerjaan nyata yang menjadi dasarnya.</w:t>
+      </w:r>
+    </w:p>
+    <w:p>
+      <w:pPr>
+        <w:spacing w:after="120" w:line="276"/>
+      </w:pPr>
+      <w:r>
+        <w:rPr>
+          <w:sz w:val="22"/>
+          <w:szCs w:val="22"/>
+        </w:rPr>
+        <w:t>Mengapa MARGIN bisa positif sementara Profit Outlook menunjukkan proyeksi rugi? Keduanya menjawab pertanyaan yang berbeda. MARGIN dan Project Health melihat ke belakang pada biaya yang sudah terjadi sejauh ini — di awal project hanya sedikit biaya yang tercatat, sehingga margin tampak tinggi secara alami. Profit Outlook melihat ke depan, memproyeksikan biaya akhir dari laju pengeluaran saat ini. Jika tim saat ini mengeluarkan biaya per manday lebih cepat daripada yang direncanakan, biaya akhir yang diproyeksikan dapat melebihi nilai kontrak meskipun margin hari ini masih tampak sehat. Ini memang dirancang demikian — ini adalah peringatan dini, bukan kesalahan perhitungan.</w:t>
       </w:r>
     </w:p>
     <w:p>
@@ -3800,7 +4098,215 @@
           <w:sz w:val="26"/>
           <w:szCs w:val="26"/>
         </w:rPr>
-        <w:t xml:space="preserve">6.12 Utilisasi Sumber Daya</w:t>
+        <w:t>6.12 Skor Project Health</w:t>
+      </w:r>
+    </w:p>
+    <w:p>
+      <w:pPr>
+        <w:spacing w:after="120" w:line="276"/>
+      </w:pPr>
+      <w:r>
+        <w:rPr>
+          <w:sz w:val="22"/>
+          <w:szCs w:val="22"/>
+        </w:rPr>
+        <w:t>Setiap project juga memiliki skor Health dari 0 hingga 100, ditampilkan sebagai badge berwarna (Healthy / At Risk / Critical). Skor ini memadukan lima sinyal berbobot menjadi satu angka sehingga manajer dapat melihat masalah secara sekilas:</w:t>
+      </w:r>
+    </w:p>
+    <w:p>
+      <w:pPr>
+        <w:pStyle w:val="ListParagraph"/>
+        <w:numPr>
+          <w:ilvl w:val="0"/>
+          <w:numId w:val="1"/>
+        </w:numPr>
+        <w:spacing w:after="60" w:line="268"/>
+      </w:pPr>
+      <w:r>
+        <w:rPr>
+          <w:b/>
+          <w:bCs/>
+          <w:sz w:val="22"/>
+          <w:szCs w:val="22"/>
+        </w:rPr>
+        <w:t xml:space="preserve">Margin (30%) — </w:t>
+      </w:r>
+      <w:r>
+        <w:rPr>
+          <w:b w:val="false"/>
+          <w:bCs w:val="false"/>
+          <w:sz w:val="22"/>
+          <w:szCs w:val="22"/>
+        </w:rPr>
+        <w:t>margin aktual dibandingkan dengan margin estimasi.</w:t>
+      </w:r>
+    </w:p>
+    <w:p>
+      <w:pPr>
+        <w:pStyle w:val="ListParagraph"/>
+        <w:numPr>
+          <w:ilvl w:val="0"/>
+          <w:numId w:val="1"/>
+        </w:numPr>
+        <w:spacing w:after="60" w:line="268"/>
+      </w:pPr>
+      <w:r>
+        <w:rPr>
+          <w:b/>
+          <w:bCs/>
+          <w:sz w:val="22"/>
+          <w:szCs w:val="22"/>
+        </w:rPr>
+        <w:t xml:space="preserve">RAID (20%) — </w:t>
+      </w:r>
+      <w:r>
+        <w:rPr>
+          <w:b w:val="false"/>
+          <w:bCs w:val="false"/>
+          <w:sz w:val="22"/>
+          <w:szCs w:val="22"/>
+        </w:rPr>
+        <w:t>jumlah dan tingkat keparahan risiko serta isu yang terbuka.</w:t>
+      </w:r>
+    </w:p>
+    <w:p>
+      <w:pPr>
+        <w:pStyle w:val="ListParagraph"/>
+        <w:numPr>
+          <w:ilvl w:val="0"/>
+          <w:numId w:val="1"/>
+        </w:numPr>
+        <w:spacing w:after="60" w:line="268"/>
+      </w:pPr>
+      <w:r>
+        <w:rPr>
+          <w:b/>
+          <w:bCs/>
+          <w:sz w:val="22"/>
+          <w:szCs w:val="22"/>
+        </w:rPr>
+        <w:t xml:space="preserve">Expenses (15%) — </w:t>
+      </w:r>
+      <w:r>
+        <w:rPr>
+          <w:b w:val="false"/>
+          <w:bCs w:val="false"/>
+          <w:sz w:val="22"/>
+          <w:szCs w:val="22"/>
+        </w:rPr>
+        <w:t>biaya yang masih menunggu persetujuan.</w:t>
+      </w:r>
+    </w:p>
+    <w:p>
+      <w:pPr>
+        <w:pStyle w:val="ListParagraph"/>
+        <w:numPr>
+          <w:ilvl w:val="0"/>
+          <w:numId w:val="1"/>
+        </w:numPr>
+        <w:spacing w:after="60" w:line="268"/>
+      </w:pPr>
+      <w:r>
+        <w:rPr>
+          <w:b/>
+          <w:bCs/>
+          <w:sz w:val="22"/>
+          <w:szCs w:val="22"/>
+        </w:rPr>
+        <w:t xml:space="preserve">Billing (20%) — </w:t>
+      </w:r>
+      <w:r>
+        <w:rPr>
+          <w:b w:val="false"/>
+          <w:bCs w:val="false"/>
+          <w:sz w:val="22"/>
+          <w:szCs w:val="22"/>
+        </w:rPr>
+        <w:t>kemajuan termin dan invoice yang jatuh tempo.</w:t>
+      </w:r>
+    </w:p>
+    <w:p>
+      <w:pPr>
+        <w:pStyle w:val="ListParagraph"/>
+        <w:numPr>
+          <w:ilvl w:val="0"/>
+          <w:numId w:val="1"/>
+        </w:numPr>
+        <w:spacing w:after="60" w:line="268"/>
+      </w:pPr>
+      <w:r>
+        <w:rPr>
+          <w:b/>
+          <w:bCs/>
+          <w:sz w:val="22"/>
+          <w:szCs w:val="22"/>
+        </w:rPr>
+        <w:t xml:space="preserve">Schedule (15%) — </w:t>
+      </w:r>
+      <w:r>
+        <w:rPr>
+          <w:b w:val="false"/>
+          <w:bCs w:val="false"/>
+          <w:sz w:val="22"/>
+          <w:szCs w:val="22"/>
+        </w:rPr>
+        <w:t>kemajuan tugas terhadap timeline yang direncanakan.</w:t>
+      </w:r>
+    </w:p>
+    <w:p>
+      <w:pPr>
+        <w:spacing w:after="120" w:line="276"/>
+      </w:pPr>
+      <w:r>
+        <w:rPr>
+          <w:sz w:val="22"/>
+          <w:szCs w:val="22"/>
+        </w:rPr>
+        <w:t>Seperti angka finansial lainnya, Project Health disembunyikan dari peran tanpa visibilitas finansial (Principal, tim delivery, dan HR).</w:t>
+      </w:r>
+    </w:p>
+    <w:p>
+      <w:pPr>
+        <w:pStyle w:val="Heading2"/>
+        <w:spacing w:after="90" w:before="220"/>
+      </w:pPr>
+      <w:r>
+        <w:rPr>
+          <w:b/>
+          <w:bCs/>
+          <w:color w:val="0F1B14"/>
+          <w:sz w:val="26"/>
+          <w:szCs w:val="26"/>
+        </w:rPr>
+        <w:t>6.13 Rekap PPN (VAT Recap)</w:t>
+      </w:r>
+    </w:p>
+    <w:p>
+      <w:pPr>
+        <w:spacing w:after="120" w:line="276"/>
+      </w:pPr>
+      <w:r>
+        <w:rPr>
+          <w:sz w:val="22"/>
+          <w:szCs w:val="22"/>
+        </w:rPr>
+        <w:t xml:space="preserve">Rekap PPN menjumlahkan seluruh invoice berstatus INVOICED dan PAID ke dalam rincian 12 bulan + total tahunan, untuk kebutuhan pelaporan pajak.</w:t>
+      </w:r>
+    </w:p>
+    <w:p>
+      <w:pPr>
+        <w:pStyle w:val="Heading2"/>
+        <w:spacing w:after="90" w:before="220"/>
+      </w:pPr>
+      <w:r>
+        <w:rPr>
+          <w:b/>
+          <w:bCs/>
+          <w:color w:val="0F1B14"/>
+          <w:sz w:val="26"/>
+          <w:szCs w:val="26"/>
+        </w:rPr>
+        <w:t>6.14 Utilisasi Sumber Daya</w:t>
       </w:r>
     </w:p>
     <w:p>
@@ -5281,6 +5787,386 @@
           <w:sz w:val="23"/>
           <w:szCs w:val="23"/>
         </w:rPr>
+        <w:t>Penjelasan tiap angka</w:t>
+      </w:r>
+    </w:p>
+    <w:p>
+      <w:pPr>
+        <w:pStyle w:val="ListParagraph"/>
+        <w:numPr>
+          <w:ilvl w:val="0"/>
+          <w:numId w:val="1"/>
+        </w:numPr>
+        <w:spacing w:after="60" w:line="268"/>
+      </w:pPr>
+      <w:r>
+        <w:rPr>
+          <w:b/>
+          <w:bCs/>
+          <w:sz w:val="22"/>
+          <w:szCs w:val="22"/>
+        </w:rPr>
+        <w:t xml:space="preserve">resourceCost — </w:t>
+      </w:r>
+      <w:r>
+        <w:rPr>
+          <w:b w:val="false"/>
+          <w:bCs w:val="false"/>
+          <w:sz w:val="22"/>
+          <w:szCs w:val="22"/>
+        </w:rPr>
+        <w:t>total biaya tenaga kerja dari timesheet APPROVED: jam kerja dikonversi ke manday (jam ÷ 8) lalu dikalikan tarif harian tiap sumber daya.</w:t>
+      </w:r>
+    </w:p>
+    <w:p>
+      <w:pPr>
+        <w:pStyle w:val="ListParagraph"/>
+        <w:numPr>
+          <w:ilvl w:val="0"/>
+          <w:numId w:val="1"/>
+        </w:numPr>
+        <w:spacing w:after="60" w:line="268"/>
+      </w:pPr>
+      <w:r>
+        <w:rPr>
+          <w:b/>
+          <w:bCs/>
+          <w:sz w:val="22"/>
+          <w:szCs w:val="22"/>
+        </w:rPr>
+        <w:t xml:space="preserve">additionalCost — </w:t>
+      </w:r>
+      <w:r>
+        <w:rPr>
+          <w:b w:val="false"/>
+          <w:bCs w:val="false"/>
+          <w:sz w:val="22"/>
+          <w:szCs w:val="22"/>
+        </w:rPr>
+        <w:t>total biaya non-tenaga kerja yang APPROVED (software, hardware, lisensi, perjalanan, lainnya); biaya pending dan ditolak tidak dihitung.</w:t>
+      </w:r>
+    </w:p>
+    <w:p>
+      <w:pPr>
+        <w:pStyle w:val="ListParagraph"/>
+        <w:numPr>
+          <w:ilvl w:val="0"/>
+          <w:numId w:val="1"/>
+        </w:numPr>
+        <w:spacing w:after="60" w:line="268"/>
+      </w:pPr>
+      <w:r>
+        <w:rPr>
+          <w:b/>
+          <w:bCs/>
+          <w:sz w:val="22"/>
+          <w:szCs w:val="22"/>
+        </w:rPr>
+        <w:t xml:space="preserve">actualCost — </w:t>
+      </w:r>
+      <w:r>
+        <w:rPr>
+          <w:b w:val="false"/>
+          <w:bCs w:val="false"/>
+          <w:sz w:val="22"/>
+          <w:szCs w:val="22"/>
+        </w:rPr>
+        <w:t>biaya nyata project sejauh ini, yaitu resourceCost + additionalCost.</w:t>
+      </w:r>
+    </w:p>
+    <w:p>
+      <w:pPr>
+        <w:pStyle w:val="ListParagraph"/>
+        <w:numPr>
+          <w:ilvl w:val="0"/>
+          <w:numId w:val="1"/>
+        </w:numPr>
+        <w:spacing w:after="60" w:line="268"/>
+      </w:pPr>
+      <w:r>
+        <w:rPr>
+          <w:b/>
+          <w:bCs/>
+          <w:sz w:val="22"/>
+          <w:szCs w:val="22"/>
+        </w:rPr>
+        <w:t xml:space="preserve">actualProfit — </w:t>
+      </w:r>
+      <w:r>
+        <w:rPr>
+          <w:b w:val="false"/>
+          <w:bCs w:val="false"/>
+          <w:sz w:val="22"/>
+          <w:szCs w:val="22"/>
+        </w:rPr>
+        <w:t>nilai kontrak dikurangi actualCost; profit yang sudah dibukukan sejauh ini, dalam Rupiah.</w:t>
+      </w:r>
+    </w:p>
+    <w:p>
+      <w:pPr>
+        <w:pStyle w:val="ListParagraph"/>
+        <w:numPr>
+          <w:ilvl w:val="0"/>
+          <w:numId w:val="1"/>
+        </w:numPr>
+        <w:spacing w:after="60" w:line="268"/>
+      </w:pPr>
+      <w:r>
+        <w:rPr>
+          <w:b/>
+          <w:bCs/>
+          <w:sz w:val="22"/>
+          <w:szCs w:val="22"/>
+        </w:rPr>
+        <w:t xml:space="preserve">marginPct — </w:t>
+      </w:r>
+      <w:r>
+        <w:rPr>
+          <w:b w:val="false"/>
+          <w:bCs w:val="false"/>
+          <w:sz w:val="22"/>
+          <w:szCs w:val="22"/>
+        </w:rPr>
+        <w:t>actualProfit sebagai persentase dari nilai kontrak; margin keuntungan sejauh ini.</w:t>
+      </w:r>
+    </w:p>
+    <w:p>
+      <w:pPr>
+        <w:pStyle w:val="ListParagraph"/>
+        <w:numPr>
+          <w:ilvl w:val="0"/>
+          <w:numId w:val="1"/>
+        </w:numPr>
+        <w:spacing w:after="60" w:line="268"/>
+      </w:pPr>
+      <w:r>
+        <w:rPr>
+          <w:b/>
+          <w:bCs/>
+          <w:sz w:val="22"/>
+          <w:szCs w:val="22"/>
+        </w:rPr>
+        <w:t xml:space="preserve">DPP (revenueNet) — </w:t>
+      </w:r>
+      <w:r>
+        <w:rPr>
+          <w:b w:val="false"/>
+          <w:bCs w:val="false"/>
+          <w:sz w:val="22"/>
+          <w:szCs w:val="22"/>
+        </w:rPr>
+        <w:t>Dasar Pengenaan Pajak, yaitu pendapatan bersih setelah PPN dikeluarkan dari nilai kontrak.</w:t>
+      </w:r>
+    </w:p>
+    <w:p>
+      <w:pPr>
+        <w:pStyle w:val="ListParagraph"/>
+        <w:numPr>
+          <w:ilvl w:val="0"/>
+          <w:numId w:val="1"/>
+        </w:numPr>
+        <w:spacing w:after="60" w:line="268"/>
+      </w:pPr>
+      <w:r>
+        <w:rPr>
+          <w:b/>
+          <w:bCs/>
+          <w:sz w:val="22"/>
+          <w:szCs w:val="22"/>
+        </w:rPr>
+        <w:t xml:space="preserve">PPN (VAT) — </w:t>
+      </w:r>
+      <w:r>
+        <w:rPr>
+          <w:b w:val="false"/>
+          <w:bCs w:val="false"/>
+          <w:sz w:val="22"/>
+          <w:szCs w:val="22"/>
+        </w:rPr>
+        <w:t>porsi Pajak Pertambahan Nilai (default 11%) yang dipisahkan dari nilai kontrak.</w:t>
+      </w:r>
+    </w:p>
+    <w:p>
+      <w:pPr>
+        <w:pStyle w:val="ListParagraph"/>
+        <w:numPr>
+          <w:ilvl w:val="0"/>
+          <w:numId w:val="1"/>
+        </w:numPr>
+        <w:spacing w:after="60" w:line="268"/>
+      </w:pPr>
+      <w:r>
+        <w:rPr>
+          <w:b/>
+          <w:bCs/>
+          <w:sz w:val="22"/>
+          <w:szCs w:val="22"/>
+        </w:rPr>
+        <w:t xml:space="preserve">burnRatePct — </w:t>
+      </w:r>
+      <w:r>
+        <w:rPr>
+          <w:b w:val="false"/>
+          <w:bCs w:val="false"/>
+          <w:sz w:val="22"/>
+          <w:szCs w:val="22"/>
+        </w:rPr>
+        <w:t>seberapa banyak pekerjaan yang direncanakan telah selesai: manday aktual ÷ manday direncanakan, dibatasi maksimal 100%.</w:t>
+      </w:r>
+    </w:p>
+    <w:p>
+      <w:pPr>
+        <w:pStyle w:val="ListParagraph"/>
+        <w:numPr>
+          <w:ilvl w:val="0"/>
+          <w:numId w:val="1"/>
+        </w:numPr>
+        <w:spacing w:after="60" w:line="268"/>
+      </w:pPr>
+      <w:r>
+        <w:rPr>
+          <w:b/>
+          <w:bCs/>
+          <w:sz w:val="22"/>
+          <w:szCs w:val="22"/>
+        </w:rPr>
+        <w:t xml:space="preserve">recognizedRevenue — </w:t>
+      </w:r>
+      <w:r>
+        <w:rPr>
+          <w:b w:val="false"/>
+          <w:bCs w:val="false"/>
+          <w:sz w:val="22"/>
+          <w:szCs w:val="22"/>
+        </w:rPr>
+        <w:t>pendapatan yang diakui sampai saat ini dengan prinsip persentase penyelesaian: burnRatePct × pendapatan bersih (DPP).</w:t>
+      </w:r>
+    </w:p>
+    <w:p>
+      <w:pPr>
+        <w:pStyle w:val="ListParagraph"/>
+        <w:numPr>
+          <w:ilvl w:val="0"/>
+          <w:numId w:val="1"/>
+        </w:numPr>
+        <w:spacing w:after="60" w:line="268"/>
+      </w:pPr>
+      <w:r>
+        <w:rPr>
+          <w:b/>
+          <w:bCs/>
+          <w:sz w:val="22"/>
+          <w:szCs w:val="22"/>
+        </w:rPr>
+        <w:t xml:space="preserve">loadedResourceCost — </w:t>
+      </w:r>
+      <w:r>
+        <w:rPr>
+          <w:b w:val="false"/>
+          <w:bCs w:val="false"/>
+          <w:sz w:val="22"/>
+          <w:szCs w:val="22"/>
+        </w:rPr>
+        <w:t>resourceCost dikalikan faktor overhead, agar biaya tidak langsung (overhead) perusahaan ikut diperhitungkan.</w:t>
+      </w:r>
+    </w:p>
+    <w:p>
+      <w:pPr>
+        <w:pStyle w:val="ListParagraph"/>
+        <w:numPr>
+          <w:ilvl w:val="0"/>
+          <w:numId w:val="1"/>
+        </w:numPr>
+        <w:spacing w:after="60" w:line="268"/>
+      </w:pPr>
+      <w:r>
+        <w:rPr>
+          <w:b/>
+          <w:bCs/>
+          <w:sz w:val="22"/>
+          <w:szCs w:val="22"/>
+        </w:rPr>
+        <w:t xml:space="preserve">netActualCost — </w:t>
+      </w:r>
+      <w:r>
+        <w:rPr>
+          <w:b w:val="false"/>
+          <w:bCs w:val="false"/>
+          <w:sz w:val="22"/>
+          <w:szCs w:val="22"/>
+        </w:rPr>
+        <w:t>biaya penuh (fully-loaded): loadedResourceCost + additionalCost.</w:t>
+      </w:r>
+    </w:p>
+    <w:p>
+      <w:pPr>
+        <w:pStyle w:val="ListParagraph"/>
+        <w:numPr>
+          <w:ilvl w:val="0"/>
+          <w:numId w:val="1"/>
+        </w:numPr>
+        <w:spacing w:after="60" w:line="268"/>
+      </w:pPr>
+      <w:r>
+        <w:rPr>
+          <w:b/>
+          <w:bCs/>
+          <w:sz w:val="22"/>
+          <w:szCs w:val="22"/>
+        </w:rPr>
+        <w:t xml:space="preserve">netActualProfit — </w:t>
+      </w:r>
+      <w:r>
+        <w:rPr>
+          <w:b w:val="false"/>
+          <w:bCs w:val="false"/>
+          <w:sz w:val="22"/>
+          <w:szCs w:val="22"/>
+        </w:rPr>
+        <w:t>pendapatan bersih (DPP) dikurangi netActualCost; profit setelah overhead diperhitungkan.</w:t>
+      </w:r>
+    </w:p>
+    <w:p>
+      <w:pPr>
+        <w:pStyle w:val="ListParagraph"/>
+        <w:numPr>
+          <w:ilvl w:val="0"/>
+          <w:numId w:val="1"/>
+        </w:numPr>
+        <w:spacing w:after="60" w:line="268"/>
+      </w:pPr>
+      <w:r>
+        <w:rPr>
+          <w:b/>
+          <w:bCs/>
+          <w:sz w:val="22"/>
+          <w:szCs w:val="22"/>
+        </w:rPr>
+        <w:t xml:space="preserve">netMarginPct — </w:t>
+      </w:r>
+      <w:r>
+        <w:rPr>
+          <w:b w:val="false"/>
+          <w:bCs w:val="false"/>
+          <w:sz w:val="22"/>
+          <w:szCs w:val="22"/>
+        </w:rPr>
+        <w:t>netActualProfit sebagai persentase dari pendapatan bersih (DPP); margin konservatif yang sudah disesuaikan overhead.</w:t>
+      </w:r>
+    </w:p>
+    <w:p>
+      <w:pPr>
+        <w:pStyle w:val="Heading3"/>
+        <w:spacing w:after="70" w:before="160"/>
+      </w:pPr>
+      <w:r>
+        <w:rPr>
+          <w:b/>
+          <w:bCs/>
+          <w:color w:val="0F1B14"/>
+          <w:sz w:val="23"/>
+          <w:szCs w:val="23"/>
+        </w:rPr>
         <w:t xml:space="preserve">Contoh termin penagihan</w:t>
       </w:r>
     </w:p>
@@ -5591,6 +6477,34 @@
     </w:tbl>
     <w:p>
       <w:pPr>
+        <w:pStyle w:val="Heading3"/>
+        <w:spacing w:after="70" w:before="160"/>
+      </w:pPr>
+      <w:r>
+        <w:rPr>
+          <w:b/>
+          <w:bCs/>
+          <w:color w:val="0F1B14"/>
+          <w:sz w:val="23"/>
+          <w:szCs w:val="23"/>
+        </w:rPr>
+        <w:t>Profit Outlook (ilustrasi)</w:t>
+      </w:r>
+    </w:p>
+    <w:p>
+      <w:pPr>
+        <w:spacing w:after="120" w:line="276"/>
+      </w:pPr>
+      <w:r>
+        <w:rPr>
+          <w:sz w:val="22"/>
+          <w:szCs w:val="22"/>
+        </w:rPr>
+        <w:t>Memakai project yang sama (60 manday tercatat dari 100 yang direncanakan, jadi 60% pekerjaan selesai — di atas ambang 20%, sehingga putusan ditampilkan): avgDailyRate = 110.000.000 ÷ 60 = Rp 1.833.333; forecastCost = (100 × 1.833.333) + 20.000.000 = Rp 203.333.333; forecastProfit = 1.000.000.000 − 203.333.333 = Rp 796.666.667 (sekitar 79,7% margin proyeksi). Status: On Track for Profit. Perhatikan margin proyeksi ini (79,7%) berbeda dari MARGIN saat ini (87,0%), karena MARGIN hanya mencerminkan biaya yang sudah tercatat sementara Outlook memproyeksikan biaya ke seluruh 100 manday yang direncanakan.</w:t>
+      </w:r>
+    </w:p>
+    <w:p>
+      <w:pPr>
         <w:pStyle w:val="Heading1"/>
         <w:spacing w:after="140" w:before="360"/>
       </w:pPr>
@@ -6153,1324 +7067,6 @@
           <w:szCs w:val="22"/>
         </w:rPr>
         <w:t xml:space="preserve">antarmuka aplikasi berbahasa Inggris; dokumen ini berbahasa Indonesia khusus untuk bahan presentasi.</w:t>
-      </w:r>
-    </w:p>
-    <w:p>
-      <w:r>
-        <w:br w:type="page"/>
-      </w:r>
-    </w:p>
-    <w:p>
-      <w:pPr>
-        <w:pStyle w:val="Heading1"/>
-        <w:spacing w:after="140" w:before="360"/>
-      </w:pPr>
-      <w:r>
-        <w:rPr>
-          <w:b/>
-          <w:bCs/>
-          <w:color w:val="1F7A4D"/>
-          <w:sz w:val="30"/>
-          <w:szCs w:val="30"/>
-        </w:rPr>
-        <w:t xml:space="preserve">Lampiran A — Glosarium Perhitungan</w:t>
-      </w:r>
-    </w:p>
-    <w:p>
-      <w:pPr>
-        <w:spacing w:after="120" w:line="276"/>
-      </w:pPr>
-      <w:r>
-        <w:rPr>
-          <w:sz w:val="22"/>
-          <w:szCs w:val="22"/>
-        </w:rPr>
-        <w:t xml:space="preserve">Penjelasan ringkas setiap metrik finansial beserta rumus dan contoh angka (mengacu contoh project pada Bagian 7: nilai kontrak Rp 1.000.000.000 termasuk PPN 11%).</w:t>
-      </w:r>
-    </w:p>
-    <w:tbl>
-      <w:tblPr>
-        <w:tblW w:type="pct" w:w="100%"/>
-        <w:tblBorders>
-          <w:top w:val="single" w:color="CCCCCC" w:sz="4"/>
-          <w:left w:val="single" w:color="CCCCCC" w:sz="4"/>
-          <w:bottom w:val="single" w:color="CCCCCC" w:sz="4"/>
-          <w:right w:val="single" w:color="CCCCCC" w:sz="4"/>
-          <w:insideH w:val="single" w:color="DDDDDD" w:sz="2"/>
-          <w:insideV w:val="single" w:color="DDDDDD" w:sz="2"/>
-        </w:tblBorders>
-      </w:tblPr>
-      <w:tblGrid>
-        <w:gridCol w:w="100"/>
-        <w:gridCol w:w="100"/>
-        <w:gridCol w:w="100"/>
-        <w:gridCol w:w="100"/>
-      </w:tblGrid>
-      <w:tr>
-        <w:trPr>
-          <w:tblHeader/>
-        </w:trPr>
-        <w:tc>
-          <w:tcPr>
-            <w:tcW w:type="pct" w:w="17%"/>
-            <w:shd w:fill="1F7A4D"/>
-            <w:tcMar>
-              <w:top w:type="dxa" w:w="60"/>
-              <w:left w:type="dxa" w:w="90"/>
-              <w:bottom w:type="dxa" w:w="60"/>
-              <w:right w:type="dxa" w:w="90"/>
-            </w:tcMar>
-          </w:tcPr>
-          <w:p>
-            <w:r>
-              <w:rPr>
-                <w:b/>
-                <w:bCs/>
-                <w:color w:val="FFFFFF"/>
-                <w:sz w:val="20"/>
-                <w:szCs w:val="20"/>
-              </w:rPr>
-              <w:t xml:space="preserve">Istilah</w:t>
-            </w:r>
-          </w:p>
-        </w:tc>
-        <w:tc>
-          <w:tcPr>
-            <w:tcW w:type="pct" w:w="33%"/>
-            <w:shd w:fill="1F7A4D"/>
-            <w:tcMar>
-              <w:top w:type="dxa" w:w="60"/>
-              <w:left w:type="dxa" w:w="90"/>
-              <w:bottom w:type="dxa" w:w="60"/>
-              <w:right w:type="dxa" w:w="90"/>
-            </w:tcMar>
-          </w:tcPr>
-          <w:p>
-            <w:r>
-              <w:rPr>
-                <w:b/>
-                <w:bCs/>
-                <w:color w:val="FFFFFF"/>
-                <w:sz w:val="20"/>
-                <w:szCs w:val="20"/>
-              </w:rPr>
-              <w:t xml:space="preserve">Arti</w:t>
-            </w:r>
-          </w:p>
-        </w:tc>
-        <w:tc>
-          <w:tcPr>
-            <w:tcW w:type="pct" w:w="30%"/>
-            <w:shd w:fill="1F7A4D"/>
-            <w:tcMar>
-              <w:top w:type="dxa" w:w="60"/>
-              <w:left w:type="dxa" w:w="90"/>
-              <w:bottom w:type="dxa" w:w="60"/>
-              <w:right w:type="dxa" w:w="90"/>
-            </w:tcMar>
-          </w:tcPr>
-          <w:p>
-            <w:r>
-              <w:rPr>
-                <w:b/>
-                <w:bCs/>
-                <w:color w:val="FFFFFF"/>
-                <w:sz w:val="20"/>
-                <w:szCs w:val="20"/>
-              </w:rPr>
-              <w:t xml:space="preserve">Rumus</w:t>
-            </w:r>
-          </w:p>
-        </w:tc>
-        <w:tc>
-          <w:tcPr>
-            <w:tcW w:type="pct" w:w="20%"/>
-            <w:shd w:fill="1F7A4D"/>
-            <w:tcMar>
-              <w:top w:type="dxa" w:w="60"/>
-              <w:left w:type="dxa" w:w="90"/>
-              <w:bottom w:type="dxa" w:w="60"/>
-              <w:right w:type="dxa" w:w="90"/>
-            </w:tcMar>
-          </w:tcPr>
-          <w:p>
-            <w:r>
-              <w:rPr>
-                <w:b/>
-                <w:bCs/>
-                <w:color w:val="FFFFFF"/>
-                <w:sz w:val="20"/>
-                <w:szCs w:val="20"/>
-              </w:rPr>
-              <w:t xml:space="preserve">Contoh</w:t>
-            </w:r>
-          </w:p>
-        </w:tc>
-      </w:tr>
-      <w:tr>
-        <w:tc>
-          <w:tcPr>
-            <w:tcW w:type="pct" w:w="17%"/>
-            <w:tcMar>
-              <w:top w:type="dxa" w:w="60"/>
-              <w:left w:type="dxa" w:w="90"/>
-              <w:bottom w:type="dxa" w:w="60"/>
-              <w:right w:type="dxa" w:w="90"/>
-            </w:tcMar>
-          </w:tcPr>
-          <w:p>
-            <w:r>
-              <w:rPr>
-                <w:color w:val="0F1B14"/>
-                <w:sz w:val="20"/>
-                <w:szCs w:val="20"/>
-              </w:rPr>
-              <w:t xml:space="preserve">resourceCost</w:t>
-            </w:r>
-          </w:p>
-        </w:tc>
-        <w:tc>
-          <w:tcPr>
-            <w:tcW w:type="pct" w:w="33%"/>
-            <w:tcMar>
-              <w:top w:type="dxa" w:w="60"/>
-              <w:left w:type="dxa" w:w="90"/>
-              <w:bottom w:type="dxa" w:w="60"/>
-              <w:right w:type="dxa" w:w="90"/>
-            </w:tcMar>
-          </w:tcPr>
-          <w:p>
-            <w:r>
-              <w:rPr>
-                <w:color w:val="0F1B14"/>
-                <w:sz w:val="20"/>
-                <w:szCs w:val="20"/>
-              </w:rPr>
-              <w:t xml:space="preserve">Biaya jam kerja konsultan yang sudah disetujui (APPROVED)</w:t>
-            </w:r>
-          </w:p>
-        </w:tc>
-        <w:tc>
-          <w:tcPr>
-            <w:tcW w:type="pct" w:w="30%"/>
-            <w:tcMar>
-              <w:top w:type="dxa" w:w="60"/>
-              <w:left w:type="dxa" w:w="90"/>
-              <w:bottom w:type="dxa" w:w="60"/>
-              <w:right w:type="dxa" w:w="90"/>
-            </w:tcMar>
-          </w:tcPr>
-          <w:p>
-            <w:r>
-              <w:rPr>
-                <w:color w:val="0F1B14"/>
-                <w:sz w:val="20"/>
-                <w:szCs w:val="20"/>
-              </w:rPr>
-              <w:t xml:space="preserve">Σ (jam ÷ 8 × tarif harian)</w:t>
-            </w:r>
-          </w:p>
-        </w:tc>
-        <w:tc>
-          <w:tcPr>
-            <w:tcW w:type="pct" w:w="20%"/>
-            <w:tcMar>
-              <w:top w:type="dxa" w:w="60"/>
-              <w:left w:type="dxa" w:w="90"/>
-              <w:bottom w:type="dxa" w:w="60"/>
-              <w:right w:type="dxa" w:w="90"/>
-            </w:tcMar>
-          </w:tcPr>
-          <w:p>
-            <w:r>
-              <w:rPr>
-                <w:color w:val="0F1B14"/>
-                <w:sz w:val="20"/>
-                <w:szCs w:val="20"/>
-              </w:rPr>
-              <w:t xml:space="preserve">Rp 110.000.000</w:t>
-            </w:r>
-          </w:p>
-        </w:tc>
-      </w:tr>
-      <w:tr>
-        <w:tc>
-          <w:tcPr>
-            <w:tcW w:type="pct" w:w="17%"/>
-            <w:shd w:fill="F1F6F2"/>
-            <w:tcMar>
-              <w:top w:type="dxa" w:w="60"/>
-              <w:left w:type="dxa" w:w="90"/>
-              <w:bottom w:type="dxa" w:w="60"/>
-              <w:right w:type="dxa" w:w="90"/>
-            </w:tcMar>
-          </w:tcPr>
-          <w:p>
-            <w:r>
-              <w:rPr>
-                <w:color w:val="0F1B14"/>
-                <w:sz w:val="20"/>
-                <w:szCs w:val="20"/>
-              </w:rPr>
-              <w:t xml:space="preserve">additionalCost</w:t>
-            </w:r>
-          </w:p>
-        </w:tc>
-        <w:tc>
-          <w:tcPr>
-            <w:tcW w:type="pct" w:w="33%"/>
-            <w:shd w:fill="F1F6F2"/>
-            <w:tcMar>
-              <w:top w:type="dxa" w:w="60"/>
-              <w:left w:type="dxa" w:w="90"/>
-              <w:bottom w:type="dxa" w:w="60"/>
-              <w:right w:type="dxa" w:w="90"/>
-            </w:tcMar>
-          </w:tcPr>
-          <w:p>
-            <w:r>
-              <w:rPr>
-                <w:color w:val="0F1B14"/>
-                <w:sz w:val="20"/>
-                <w:szCs w:val="20"/>
-              </w:rPr>
-              <w:t xml:space="preserve">Biaya non-tenaga kerja yang disetujui (lisensi, software, dll)</w:t>
-            </w:r>
-          </w:p>
-        </w:tc>
-        <w:tc>
-          <w:tcPr>
-            <w:tcW w:type="pct" w:w="30%"/>
-            <w:shd w:fill="F1F6F2"/>
-            <w:tcMar>
-              <w:top w:type="dxa" w:w="60"/>
-              <w:left w:type="dxa" w:w="90"/>
-              <w:bottom w:type="dxa" w:w="60"/>
-              <w:right w:type="dxa" w:w="90"/>
-            </w:tcMar>
-          </w:tcPr>
-          <w:p>
-            <w:r>
-              <w:rPr>
-                <w:color w:val="0F1B14"/>
-                <w:sz w:val="20"/>
-                <w:szCs w:val="20"/>
-              </w:rPr>
-              <w:t xml:space="preserve">Σ amount (APPROVED)</w:t>
-            </w:r>
-          </w:p>
-        </w:tc>
-        <w:tc>
-          <w:tcPr>
-            <w:tcW w:type="pct" w:w="20%"/>
-            <w:shd w:fill="F1F6F2"/>
-            <w:tcMar>
-              <w:top w:type="dxa" w:w="60"/>
-              <w:left w:type="dxa" w:w="90"/>
-              <w:bottom w:type="dxa" w:w="60"/>
-              <w:right w:type="dxa" w:w="90"/>
-            </w:tcMar>
-          </w:tcPr>
-          <w:p>
-            <w:r>
-              <w:rPr>
-                <w:color w:val="0F1B14"/>
-                <w:sz w:val="20"/>
-                <w:szCs w:val="20"/>
-              </w:rPr>
-              <w:t xml:space="preserve">Rp 20.000.000</w:t>
-            </w:r>
-          </w:p>
-        </w:tc>
-      </w:tr>
-      <w:tr>
-        <w:tc>
-          <w:tcPr>
-            <w:tcW w:type="pct" w:w="17%"/>
-            <w:tcMar>
-              <w:top w:type="dxa" w:w="60"/>
-              <w:left w:type="dxa" w:w="90"/>
-              <w:bottom w:type="dxa" w:w="60"/>
-              <w:right w:type="dxa" w:w="90"/>
-            </w:tcMar>
-          </w:tcPr>
-          <w:p>
-            <w:r>
-              <w:rPr>
-                <w:color w:val="0F1B14"/>
-                <w:sz w:val="20"/>
-                <w:szCs w:val="20"/>
-              </w:rPr>
-              <w:t xml:space="preserve">actualCost</w:t>
-            </w:r>
-          </w:p>
-        </w:tc>
-        <w:tc>
-          <w:tcPr>
-            <w:tcW w:type="pct" w:w="33%"/>
-            <w:tcMar>
-              <w:top w:type="dxa" w:w="60"/>
-              <w:left w:type="dxa" w:w="90"/>
-              <w:bottom w:type="dxa" w:w="60"/>
-              <w:right w:type="dxa" w:w="90"/>
-            </w:tcMar>
-          </w:tcPr>
-          <w:p>
-            <w:r>
-              <w:rPr>
-                <w:color w:val="0F1B14"/>
-                <w:sz w:val="20"/>
-                <w:szCs w:val="20"/>
-              </w:rPr>
-              <w:t xml:space="preserve">Total biaya nyata project</w:t>
-            </w:r>
-          </w:p>
-        </w:tc>
-        <w:tc>
-          <w:tcPr>
-            <w:tcW w:type="pct" w:w="30%"/>
-            <w:tcMar>
-              <w:top w:type="dxa" w:w="60"/>
-              <w:left w:type="dxa" w:w="90"/>
-              <w:bottom w:type="dxa" w:w="60"/>
-              <w:right w:type="dxa" w:w="90"/>
-            </w:tcMar>
-          </w:tcPr>
-          <w:p>
-            <w:r>
-              <w:rPr>
-                <w:color w:val="0F1B14"/>
-                <w:sz w:val="20"/>
-                <w:szCs w:val="20"/>
-              </w:rPr>
-              <w:t xml:space="preserve">resourceCost + additionalCost</w:t>
-            </w:r>
-          </w:p>
-        </w:tc>
-        <w:tc>
-          <w:tcPr>
-            <w:tcW w:type="pct" w:w="20%"/>
-            <w:tcMar>
-              <w:top w:type="dxa" w:w="60"/>
-              <w:left w:type="dxa" w:w="90"/>
-              <w:bottom w:type="dxa" w:w="60"/>
-              <w:right w:type="dxa" w:w="90"/>
-            </w:tcMar>
-          </w:tcPr>
-          <w:p>
-            <w:r>
-              <w:rPr>
-                <w:color w:val="0F1B14"/>
-                <w:sz w:val="20"/>
-                <w:szCs w:val="20"/>
-              </w:rPr>
-              <w:t xml:space="preserve">Rp 130.000.000</w:t>
-            </w:r>
-          </w:p>
-        </w:tc>
-      </w:tr>
-      <w:tr>
-        <w:tc>
-          <w:tcPr>
-            <w:tcW w:type="pct" w:w="17%"/>
-            <w:shd w:fill="F1F6F2"/>
-            <w:tcMar>
-              <w:top w:type="dxa" w:w="60"/>
-              <w:left w:type="dxa" w:w="90"/>
-              <w:bottom w:type="dxa" w:w="60"/>
-              <w:right w:type="dxa" w:w="90"/>
-            </w:tcMar>
-          </w:tcPr>
-          <w:p>
-            <w:r>
-              <w:rPr>
-                <w:color w:val="0F1B14"/>
-                <w:sz w:val="20"/>
-                <w:szCs w:val="20"/>
-              </w:rPr>
-              <w:t xml:space="preserve">actualProfit</w:t>
-            </w:r>
-          </w:p>
-        </w:tc>
-        <w:tc>
-          <w:tcPr>
-            <w:tcW w:type="pct" w:w="33%"/>
-            <w:shd w:fill="F1F6F2"/>
-            <w:tcMar>
-              <w:top w:type="dxa" w:w="60"/>
-              <w:left w:type="dxa" w:w="90"/>
-              <w:bottom w:type="dxa" w:w="60"/>
-              <w:right w:type="dxa" w:w="90"/>
-            </w:tcMar>
-          </w:tcPr>
-          <w:p>
-            <w:r>
-              <w:rPr>
-                <w:color w:val="0F1B14"/>
-                <w:sz w:val="20"/>
-                <w:szCs w:val="20"/>
-              </w:rPr>
-              <w:t xml:space="preserve">Profit setelah dikurangi biaya aktual</w:t>
-            </w:r>
-          </w:p>
-        </w:tc>
-        <w:tc>
-          <w:tcPr>
-            <w:tcW w:type="pct" w:w="30%"/>
-            <w:shd w:fill="F1F6F2"/>
-            <w:tcMar>
-              <w:top w:type="dxa" w:w="60"/>
-              <w:left w:type="dxa" w:w="90"/>
-              <w:bottom w:type="dxa" w:w="60"/>
-              <w:right w:type="dxa" w:w="90"/>
-            </w:tcMar>
-          </w:tcPr>
-          <w:p>
-            <w:r>
-              <w:rPr>
-                <w:color w:val="0F1B14"/>
-                <w:sz w:val="20"/>
-                <w:szCs w:val="20"/>
-              </w:rPr>
-              <w:t xml:space="preserve">contractValue − actualCost</w:t>
-            </w:r>
-          </w:p>
-        </w:tc>
-        <w:tc>
-          <w:tcPr>
-            <w:tcW w:type="pct" w:w="20%"/>
-            <w:shd w:fill="F1F6F2"/>
-            <w:tcMar>
-              <w:top w:type="dxa" w:w="60"/>
-              <w:left w:type="dxa" w:w="90"/>
-              <w:bottom w:type="dxa" w:w="60"/>
-              <w:right w:type="dxa" w:w="90"/>
-            </w:tcMar>
-          </w:tcPr>
-          <w:p>
-            <w:r>
-              <w:rPr>
-                <w:color w:val="0F1B14"/>
-                <w:sz w:val="20"/>
-                <w:szCs w:val="20"/>
-              </w:rPr>
-              <w:t xml:space="preserve">Rp 870.000.000</w:t>
-            </w:r>
-          </w:p>
-        </w:tc>
-      </w:tr>
-      <w:tr>
-        <w:tc>
-          <w:tcPr>
-            <w:tcW w:type="pct" w:w="17%"/>
-            <w:tcMar>
-              <w:top w:type="dxa" w:w="60"/>
-              <w:left w:type="dxa" w:w="90"/>
-              <w:bottom w:type="dxa" w:w="60"/>
-              <w:right w:type="dxa" w:w="90"/>
-            </w:tcMar>
-          </w:tcPr>
-          <w:p>
-            <w:r>
-              <w:rPr>
-                <w:color w:val="0F1B14"/>
-                <w:sz w:val="20"/>
-                <w:szCs w:val="20"/>
-              </w:rPr>
-              <w:t xml:space="preserve">marginPct</w:t>
-            </w:r>
-          </w:p>
-        </w:tc>
-        <w:tc>
-          <w:tcPr>
-            <w:tcW w:type="pct" w:w="33%"/>
-            <w:tcMar>
-              <w:top w:type="dxa" w:w="60"/>
-              <w:left w:type="dxa" w:w="90"/>
-              <w:bottom w:type="dxa" w:w="60"/>
-              <w:right w:type="dxa" w:w="90"/>
-            </w:tcMar>
-          </w:tcPr>
-          <w:p>
-            <w:r>
-              <w:rPr>
-                <w:color w:val="0F1B14"/>
-                <w:sz w:val="20"/>
-                <w:szCs w:val="20"/>
-              </w:rPr>
-              <w:t xml:space="preserve">Margin terhadap nilai kontrak (%)</w:t>
-            </w:r>
-          </w:p>
-        </w:tc>
-        <w:tc>
-          <w:tcPr>
-            <w:tcW w:type="pct" w:w="30%"/>
-            <w:tcMar>
-              <w:top w:type="dxa" w:w="60"/>
-              <w:left w:type="dxa" w:w="90"/>
-              <w:bottom w:type="dxa" w:w="60"/>
-              <w:right w:type="dxa" w:w="90"/>
-            </w:tcMar>
-          </w:tcPr>
-          <w:p>
-            <w:r>
-              <w:rPr>
-                <w:color w:val="0F1B14"/>
-                <w:sz w:val="20"/>
-                <w:szCs w:val="20"/>
-              </w:rPr>
-              <w:t xml:space="preserve">actualProfit ÷ contractValue × 100</w:t>
-            </w:r>
-          </w:p>
-        </w:tc>
-        <w:tc>
-          <w:tcPr>
-            <w:tcW w:type="pct" w:w="20%"/>
-            <w:tcMar>
-              <w:top w:type="dxa" w:w="60"/>
-              <w:left w:type="dxa" w:w="90"/>
-              <w:bottom w:type="dxa" w:w="60"/>
-              <w:right w:type="dxa" w:w="90"/>
-            </w:tcMar>
-          </w:tcPr>
-          <w:p>
-            <w:r>
-              <w:rPr>
-                <w:color w:val="0F1B14"/>
-                <w:sz w:val="20"/>
-                <w:szCs w:val="20"/>
-              </w:rPr>
-              <w:t xml:space="preserve">87,0%</w:t>
-            </w:r>
-          </w:p>
-        </w:tc>
-      </w:tr>
-      <w:tr>
-        <w:tc>
-          <w:tcPr>
-            <w:tcW w:type="pct" w:w="17%"/>
-            <w:shd w:fill="F1F6F2"/>
-            <w:tcMar>
-              <w:top w:type="dxa" w:w="60"/>
-              <w:left w:type="dxa" w:w="90"/>
-              <w:bottom w:type="dxa" w:w="60"/>
-              <w:right w:type="dxa" w:w="90"/>
-            </w:tcMar>
-          </w:tcPr>
-          <w:p>
-            <w:r>
-              <w:rPr>
-                <w:color w:val="0F1B14"/>
-                <w:sz w:val="20"/>
-                <w:szCs w:val="20"/>
-              </w:rPr>
-              <w:t xml:space="preserve">DPP (revenueNet)</w:t>
-            </w:r>
-          </w:p>
-        </w:tc>
-        <w:tc>
-          <w:tcPr>
-            <w:tcW w:type="pct" w:w="33%"/>
-            <w:shd w:fill="F1F6F2"/>
-            <w:tcMar>
-              <w:top w:type="dxa" w:w="60"/>
-              <w:left w:type="dxa" w:w="90"/>
-              <w:bottom w:type="dxa" w:w="60"/>
-              <w:right w:type="dxa" w:w="90"/>
-            </w:tcMar>
-          </w:tcPr>
-          <w:p>
-            <w:r>
-              <w:rPr>
-                <w:color w:val="0F1B14"/>
-                <w:sz w:val="20"/>
-                <w:szCs w:val="20"/>
-              </w:rPr>
-              <w:t xml:space="preserve">Pendapatan bersih tanpa PPN</w:t>
-            </w:r>
-          </w:p>
-        </w:tc>
-        <w:tc>
-          <w:tcPr>
-            <w:tcW w:type="pct" w:w="30%"/>
-            <w:shd w:fill="F1F6F2"/>
-            <w:tcMar>
-              <w:top w:type="dxa" w:w="60"/>
-              <w:left w:type="dxa" w:w="90"/>
-              <w:bottom w:type="dxa" w:w="60"/>
-              <w:right w:type="dxa" w:w="90"/>
-            </w:tcMar>
-          </w:tcPr>
-          <w:p>
-            <w:r>
-              <w:rPr>
-                <w:color w:val="0F1B14"/>
-                <w:sz w:val="20"/>
-                <w:szCs w:val="20"/>
-              </w:rPr>
-              <w:t xml:space="preserve">nilai ÷ 1,11 (inclusive)</w:t>
-            </w:r>
-          </w:p>
-        </w:tc>
-        <w:tc>
-          <w:tcPr>
-            <w:tcW w:type="pct" w:w="20%"/>
-            <w:shd w:fill="F1F6F2"/>
-            <w:tcMar>
-              <w:top w:type="dxa" w:w="60"/>
-              <w:left w:type="dxa" w:w="90"/>
-              <w:bottom w:type="dxa" w:w="60"/>
-              <w:right w:type="dxa" w:w="90"/>
-            </w:tcMar>
-          </w:tcPr>
-          <w:p>
-            <w:r>
-              <w:rPr>
-                <w:color w:val="0F1B14"/>
-                <w:sz w:val="20"/>
-                <w:szCs w:val="20"/>
-              </w:rPr>
-              <w:t xml:space="preserve">Rp 900.900.900,90</w:t>
-            </w:r>
-          </w:p>
-        </w:tc>
-      </w:tr>
-      <w:tr>
-        <w:tc>
-          <w:tcPr>
-            <w:tcW w:type="pct" w:w="17%"/>
-            <w:tcMar>
-              <w:top w:type="dxa" w:w="60"/>
-              <w:left w:type="dxa" w:w="90"/>
-              <w:bottom w:type="dxa" w:w="60"/>
-              <w:right w:type="dxa" w:w="90"/>
-            </w:tcMar>
-          </w:tcPr>
-          <w:p>
-            <w:r>
-              <w:rPr>
-                <w:color w:val="0F1B14"/>
-                <w:sz w:val="20"/>
-                <w:szCs w:val="20"/>
-              </w:rPr>
-              <w:t xml:space="preserve">PPN</w:t>
-            </w:r>
-          </w:p>
-        </w:tc>
-        <w:tc>
-          <w:tcPr>
-            <w:tcW w:type="pct" w:w="33%"/>
-            <w:tcMar>
-              <w:top w:type="dxa" w:w="60"/>
-              <w:left w:type="dxa" w:w="90"/>
-              <w:bottom w:type="dxa" w:w="60"/>
-              <w:right w:type="dxa" w:w="90"/>
-            </w:tcMar>
-          </w:tcPr>
-          <w:p>
-            <w:r>
-              <w:rPr>
-                <w:color w:val="0F1B14"/>
-                <w:sz w:val="20"/>
-                <w:szCs w:val="20"/>
-              </w:rPr>
-              <w:t xml:space="preserve">Bagian pajak di dalam nilai kontrak</w:t>
-            </w:r>
-          </w:p>
-        </w:tc>
-        <w:tc>
-          <w:tcPr>
-            <w:tcW w:type="pct" w:w="30%"/>
-            <w:tcMar>
-              <w:top w:type="dxa" w:w="60"/>
-              <w:left w:type="dxa" w:w="90"/>
-              <w:bottom w:type="dxa" w:w="60"/>
-              <w:right w:type="dxa" w:w="90"/>
-            </w:tcMar>
-          </w:tcPr>
-          <w:p>
-            <w:r>
-              <w:rPr>
-                <w:color w:val="0F1B14"/>
-                <w:sz w:val="20"/>
-                <w:szCs w:val="20"/>
-              </w:rPr>
-              <w:t xml:space="preserve">nilai − DPP</w:t>
-            </w:r>
-          </w:p>
-        </w:tc>
-        <w:tc>
-          <w:tcPr>
-            <w:tcW w:type="pct" w:w="20%"/>
-            <w:tcMar>
-              <w:top w:type="dxa" w:w="60"/>
-              <w:left w:type="dxa" w:w="90"/>
-              <w:bottom w:type="dxa" w:w="60"/>
-              <w:right w:type="dxa" w:w="90"/>
-            </w:tcMar>
-          </w:tcPr>
-          <w:p>
-            <w:r>
-              <w:rPr>
-                <w:color w:val="0F1B14"/>
-                <w:sz w:val="20"/>
-                <w:szCs w:val="20"/>
-              </w:rPr>
-              <w:t xml:space="preserve">Rp 99.099.099,10</w:t>
-            </w:r>
-          </w:p>
-        </w:tc>
-      </w:tr>
-      <w:tr>
-        <w:tc>
-          <w:tcPr>
-            <w:tcW w:type="pct" w:w="17%"/>
-            <w:shd w:fill="F1F6F2"/>
-            <w:tcMar>
-              <w:top w:type="dxa" w:w="60"/>
-              <w:left w:type="dxa" w:w="90"/>
-              <w:bottom w:type="dxa" w:w="60"/>
-              <w:right w:type="dxa" w:w="90"/>
-            </w:tcMar>
-          </w:tcPr>
-          <w:p>
-            <w:r>
-              <w:rPr>
-                <w:color w:val="0F1B14"/>
-                <w:sz w:val="20"/>
-                <w:szCs w:val="20"/>
-              </w:rPr>
-              <w:t xml:space="preserve">burnRatePct</w:t>
-            </w:r>
-          </w:p>
-        </w:tc>
-        <w:tc>
-          <w:tcPr>
-            <w:tcW w:type="pct" w:w="33%"/>
-            <w:shd w:fill="F1F6F2"/>
-            <w:tcMar>
-              <w:top w:type="dxa" w:w="60"/>
-              <w:left w:type="dxa" w:w="90"/>
-              <w:bottom w:type="dxa" w:w="60"/>
-              <w:right w:type="dxa" w:w="90"/>
-            </w:tcMar>
-          </w:tcPr>
-          <w:p>
-            <w:r>
-              <w:rPr>
-                <w:color w:val="0F1B14"/>
-                <w:sz w:val="20"/>
-                <w:szCs w:val="20"/>
-              </w:rPr>
-              <w:t xml:space="preserve">Tingkat penyelesaian (manday aktual vs rencana, maks 100%)</w:t>
-            </w:r>
-          </w:p>
-        </w:tc>
-        <w:tc>
-          <w:tcPr>
-            <w:tcW w:type="pct" w:w="30%"/>
-            <w:shd w:fill="F1F6F2"/>
-            <w:tcMar>
-              <w:top w:type="dxa" w:w="60"/>
-              <w:left w:type="dxa" w:w="90"/>
-              <w:bottom w:type="dxa" w:w="60"/>
-              <w:right w:type="dxa" w:w="90"/>
-            </w:tcMar>
-          </w:tcPr>
-          <w:p>
-            <w:r>
-              <w:rPr>
-                <w:color w:val="0F1B14"/>
-                <w:sz w:val="20"/>
-                <w:szCs w:val="20"/>
-              </w:rPr>
-              <w:t xml:space="preserve">min(actualMandays ÷ plannedMandays × 100, 100)</w:t>
-            </w:r>
-          </w:p>
-        </w:tc>
-        <w:tc>
-          <w:tcPr>
-            <w:tcW w:type="pct" w:w="20%"/>
-            <w:shd w:fill="F1F6F2"/>
-            <w:tcMar>
-              <w:top w:type="dxa" w:w="60"/>
-              <w:left w:type="dxa" w:w="90"/>
-              <w:bottom w:type="dxa" w:w="60"/>
-              <w:right w:type="dxa" w:w="90"/>
-            </w:tcMar>
-          </w:tcPr>
-          <w:p>
-            <w:r>
-              <w:rPr>
-                <w:color w:val="0F1B14"/>
-                <w:sz w:val="20"/>
-                <w:szCs w:val="20"/>
-              </w:rPr>
-              <w:t xml:space="preserve">60%</w:t>
-            </w:r>
-          </w:p>
-        </w:tc>
-      </w:tr>
-      <w:tr>
-        <w:tc>
-          <w:tcPr>
-            <w:tcW w:type="pct" w:w="17%"/>
-            <w:tcMar>
-              <w:top w:type="dxa" w:w="60"/>
-              <w:left w:type="dxa" w:w="90"/>
-              <w:bottom w:type="dxa" w:w="60"/>
-              <w:right w:type="dxa" w:w="90"/>
-            </w:tcMar>
-          </w:tcPr>
-          <w:p>
-            <w:r>
-              <w:rPr>
-                <w:color w:val="0F1B14"/>
-                <w:sz w:val="20"/>
-                <w:szCs w:val="20"/>
-              </w:rPr>
-              <w:t xml:space="preserve">recognizedRevenue</w:t>
-            </w:r>
-          </w:p>
-        </w:tc>
-        <w:tc>
-          <w:tcPr>
-            <w:tcW w:type="pct" w:w="33%"/>
-            <w:tcMar>
-              <w:top w:type="dxa" w:w="60"/>
-              <w:left w:type="dxa" w:w="90"/>
-              <w:bottom w:type="dxa" w:w="60"/>
-              <w:right w:type="dxa" w:w="90"/>
-            </w:tcMar>
-          </w:tcPr>
-          <w:p>
-            <w:r>
-              <w:rPr>
-                <w:color w:val="0F1B14"/>
-                <w:sz w:val="20"/>
-                <w:szCs w:val="20"/>
-              </w:rPr>
-              <w:t xml:space="preserve">Pendapatan diakui sesuai progres (PSAK 72)</w:t>
-            </w:r>
-          </w:p>
-        </w:tc>
-        <w:tc>
-          <w:tcPr>
-            <w:tcW w:type="pct" w:w="30%"/>
-            <w:tcMar>
-              <w:top w:type="dxa" w:w="60"/>
-              <w:left w:type="dxa" w:w="90"/>
-              <w:bottom w:type="dxa" w:w="60"/>
-              <w:right w:type="dxa" w:w="90"/>
-            </w:tcMar>
-          </w:tcPr>
-          <w:p>
-            <w:r>
-              <w:rPr>
-                <w:color w:val="0F1B14"/>
-                <w:sz w:val="20"/>
-                <w:szCs w:val="20"/>
-              </w:rPr>
-              <w:t xml:space="preserve">burnRatePct × DPP</w:t>
-            </w:r>
-          </w:p>
-        </w:tc>
-        <w:tc>
-          <w:tcPr>
-            <w:tcW w:type="pct" w:w="20%"/>
-            <w:tcMar>
-              <w:top w:type="dxa" w:w="60"/>
-              <w:left w:type="dxa" w:w="90"/>
-              <w:bottom w:type="dxa" w:w="60"/>
-              <w:right w:type="dxa" w:w="90"/>
-            </w:tcMar>
-          </w:tcPr>
-          <w:p>
-            <w:r>
-              <w:rPr>
-                <w:color w:val="0F1B14"/>
-                <w:sz w:val="20"/>
-                <w:szCs w:val="20"/>
-              </w:rPr>
-              <w:t xml:space="preserve">Rp 540.540.540,54</w:t>
-            </w:r>
-          </w:p>
-        </w:tc>
-      </w:tr>
-      <w:tr>
-        <w:tc>
-          <w:tcPr>
-            <w:tcW w:type="pct" w:w="17%"/>
-            <w:shd w:fill="F1F6F2"/>
-            <w:tcMar>
-              <w:top w:type="dxa" w:w="60"/>
-              <w:left w:type="dxa" w:w="90"/>
-              <w:bottom w:type="dxa" w:w="60"/>
-              <w:right w:type="dxa" w:w="90"/>
-            </w:tcMar>
-          </w:tcPr>
-          <w:p>
-            <w:r>
-              <w:rPr>
-                <w:color w:val="0F1B14"/>
-                <w:sz w:val="20"/>
-                <w:szCs w:val="20"/>
-              </w:rPr>
-              <w:t xml:space="preserve">loadedResourceCost</w:t>
-            </w:r>
-          </w:p>
-        </w:tc>
-        <w:tc>
-          <w:tcPr>
-            <w:tcW w:type="pct" w:w="33%"/>
-            <w:shd w:fill="F1F6F2"/>
-            <w:tcMar>
-              <w:top w:type="dxa" w:w="60"/>
-              <w:left w:type="dxa" w:w="90"/>
-              <w:bottom w:type="dxa" w:w="60"/>
-              <w:right w:type="dxa" w:w="90"/>
-            </w:tcMar>
-          </w:tcPr>
-          <w:p>
-            <w:r>
-              <w:rPr>
-                <w:color w:val="0F1B14"/>
-                <w:sz w:val="20"/>
-                <w:szCs w:val="20"/>
-              </w:rPr>
-              <w:t xml:space="preserve">Biaya tenaga kerja setelah dibebani overhead</w:t>
-            </w:r>
-          </w:p>
-        </w:tc>
-        <w:tc>
-          <w:tcPr>
-            <w:tcW w:type="pct" w:w="30%"/>
-            <w:shd w:fill="F1F6F2"/>
-            <w:tcMar>
-              <w:top w:type="dxa" w:w="60"/>
-              <w:left w:type="dxa" w:w="90"/>
-              <w:bottom w:type="dxa" w:w="60"/>
-              <w:right w:type="dxa" w:w="90"/>
-            </w:tcMar>
-          </w:tcPr>
-          <w:p>
-            <w:r>
-              <w:rPr>
-                <w:color w:val="0F1B14"/>
-                <w:sz w:val="20"/>
-                <w:szCs w:val="20"/>
-              </w:rPr>
-              <w:t xml:space="preserve">resourceCost × overheadMultiplier</w:t>
-            </w:r>
-          </w:p>
-        </w:tc>
-        <w:tc>
-          <w:tcPr>
-            <w:tcW w:type="pct" w:w="20%"/>
-            <w:shd w:fill="F1F6F2"/>
-            <w:tcMar>
-              <w:top w:type="dxa" w:w="60"/>
-              <w:left w:type="dxa" w:w="90"/>
-              <w:bottom w:type="dxa" w:w="60"/>
-              <w:right w:type="dxa" w:w="90"/>
-            </w:tcMar>
-          </w:tcPr>
-          <w:p>
-            <w:r>
-              <w:rPr>
-                <w:color w:val="0F1B14"/>
-                <w:sz w:val="20"/>
-                <w:szCs w:val="20"/>
-              </w:rPr>
-              <w:t xml:space="preserve">Rp 143.000.000</w:t>
-            </w:r>
-          </w:p>
-        </w:tc>
-      </w:tr>
-      <w:tr>
-        <w:tc>
-          <w:tcPr>
-            <w:tcW w:type="pct" w:w="17%"/>
-            <w:tcMar>
-              <w:top w:type="dxa" w:w="60"/>
-              <w:left w:type="dxa" w:w="90"/>
-              <w:bottom w:type="dxa" w:w="60"/>
-              <w:right w:type="dxa" w:w="90"/>
-            </w:tcMar>
-          </w:tcPr>
-          <w:p>
-            <w:r>
-              <w:rPr>
-                <w:color w:val="0F1B14"/>
-                <w:sz w:val="20"/>
-                <w:szCs w:val="20"/>
-              </w:rPr>
-              <w:t xml:space="preserve">netActualCost</w:t>
-            </w:r>
-          </w:p>
-        </w:tc>
-        <w:tc>
-          <w:tcPr>
-            <w:tcW w:type="pct" w:w="33%"/>
-            <w:tcMar>
-              <w:top w:type="dxa" w:w="60"/>
-              <w:left w:type="dxa" w:w="90"/>
-              <w:bottom w:type="dxa" w:w="60"/>
-              <w:right w:type="dxa" w:w="90"/>
-            </w:tcMar>
-          </w:tcPr>
-          <w:p>
-            <w:r>
-              <w:rPr>
-                <w:color w:val="0F1B14"/>
-                <w:sz w:val="20"/>
-                <w:szCs w:val="20"/>
-              </w:rPr>
-              <w:t xml:space="preserve">Total biaya penuh (sudah termasuk overhead)</w:t>
-            </w:r>
-          </w:p>
-        </w:tc>
-        <w:tc>
-          <w:tcPr>
-            <w:tcW w:type="pct" w:w="30%"/>
-            <w:tcMar>
-              <w:top w:type="dxa" w:w="60"/>
-              <w:left w:type="dxa" w:w="90"/>
-              <w:bottom w:type="dxa" w:w="60"/>
-              <w:right w:type="dxa" w:w="90"/>
-            </w:tcMar>
-          </w:tcPr>
-          <w:p>
-            <w:r>
-              <w:rPr>
-                <w:color w:val="0F1B14"/>
-                <w:sz w:val="20"/>
-                <w:szCs w:val="20"/>
-              </w:rPr>
-              <w:t xml:space="preserve">loadedResourceCost + additionalCost</w:t>
-            </w:r>
-          </w:p>
-        </w:tc>
-        <w:tc>
-          <w:tcPr>
-            <w:tcW w:type="pct" w:w="20%"/>
-            <w:tcMar>
-              <w:top w:type="dxa" w:w="60"/>
-              <w:left w:type="dxa" w:w="90"/>
-              <w:bottom w:type="dxa" w:w="60"/>
-              <w:right w:type="dxa" w:w="90"/>
-            </w:tcMar>
-          </w:tcPr>
-          <w:p>
-            <w:r>
-              <w:rPr>
-                <w:color w:val="0F1B14"/>
-                <w:sz w:val="20"/>
-                <w:szCs w:val="20"/>
-              </w:rPr>
-              <w:t xml:space="preserve">Rp 163.000.000</w:t>
-            </w:r>
-          </w:p>
-        </w:tc>
-      </w:tr>
-      <w:tr>
-        <w:tc>
-          <w:tcPr>
-            <w:tcW w:type="pct" w:w="17%"/>
-            <w:shd w:fill="F1F6F2"/>
-            <w:tcMar>
-              <w:top w:type="dxa" w:w="60"/>
-              <w:left w:type="dxa" w:w="90"/>
-              <w:bottom w:type="dxa" w:w="60"/>
-              <w:right w:type="dxa" w:w="90"/>
-            </w:tcMar>
-          </w:tcPr>
-          <w:p>
-            <w:r>
-              <w:rPr>
-                <w:color w:val="0F1B14"/>
-                <w:sz w:val="20"/>
-                <w:szCs w:val="20"/>
-              </w:rPr>
-              <w:t xml:space="preserve">netActualProfit</w:t>
-            </w:r>
-          </w:p>
-        </w:tc>
-        <w:tc>
-          <w:tcPr>
-            <w:tcW w:type="pct" w:w="33%"/>
-            <w:shd w:fill="F1F6F2"/>
-            <w:tcMar>
-              <w:top w:type="dxa" w:w="60"/>
-              <w:left w:type="dxa" w:w="90"/>
-              <w:bottom w:type="dxa" w:w="60"/>
-              <w:right w:type="dxa" w:w="90"/>
-            </w:tcMar>
-          </w:tcPr>
-          <w:p>
-            <w:r>
-              <w:rPr>
-                <w:color w:val="0F1B14"/>
-                <w:sz w:val="20"/>
-                <w:szCs w:val="20"/>
-              </w:rPr>
-              <w:t xml:space="preserve">Profit bersih penuh (dihitung vs DPP)</w:t>
-            </w:r>
-          </w:p>
-        </w:tc>
-        <w:tc>
-          <w:tcPr>
-            <w:tcW w:type="pct" w:w="30%"/>
-            <w:shd w:fill="F1F6F2"/>
-            <w:tcMar>
-              <w:top w:type="dxa" w:w="60"/>
-              <w:left w:type="dxa" w:w="90"/>
-              <w:bottom w:type="dxa" w:w="60"/>
-              <w:right w:type="dxa" w:w="90"/>
-            </w:tcMar>
-          </w:tcPr>
-          <w:p>
-            <w:r>
-              <w:rPr>
-                <w:color w:val="0F1B14"/>
-                <w:sz w:val="20"/>
-                <w:szCs w:val="20"/>
-              </w:rPr>
-              <w:t xml:space="preserve">revenueNet − netActualCost</w:t>
-            </w:r>
-          </w:p>
-        </w:tc>
-        <w:tc>
-          <w:tcPr>
-            <w:tcW w:type="pct" w:w="20%"/>
-            <w:shd w:fill="F1F6F2"/>
-            <w:tcMar>
-              <w:top w:type="dxa" w:w="60"/>
-              <w:left w:type="dxa" w:w="90"/>
-              <w:bottom w:type="dxa" w:w="60"/>
-              <w:right w:type="dxa" w:w="90"/>
-            </w:tcMar>
-          </w:tcPr>
-          <w:p>
-            <w:r>
-              <w:rPr>
-                <w:color w:val="0F1B14"/>
-                <w:sz w:val="20"/>
-                <w:szCs w:val="20"/>
-              </w:rPr>
-              <w:t xml:space="preserve">Rp 737.900.900,90</w:t>
-            </w:r>
-          </w:p>
-        </w:tc>
-      </w:tr>
-      <w:tr>
-        <w:tc>
-          <w:tcPr>
-            <w:tcW w:type="pct" w:w="17%"/>
-            <w:tcMar>
-              <w:top w:type="dxa" w:w="60"/>
-              <w:left w:type="dxa" w:w="90"/>
-              <w:bottom w:type="dxa" w:w="60"/>
-              <w:right w:type="dxa" w:w="90"/>
-            </w:tcMar>
-          </w:tcPr>
-          <w:p>
-            <w:r>
-              <w:rPr>
-                <w:color w:val="0F1B14"/>
-                <w:sz w:val="20"/>
-                <w:szCs w:val="20"/>
-              </w:rPr>
-              <w:t xml:space="preserve">netMarginPct</w:t>
-            </w:r>
-          </w:p>
-        </w:tc>
-        <w:tc>
-          <w:tcPr>
-            <w:tcW w:type="pct" w:w="33%"/>
-            <w:tcMar>
-              <w:top w:type="dxa" w:w="60"/>
-              <w:left w:type="dxa" w:w="90"/>
-              <w:bottom w:type="dxa" w:w="60"/>
-              <w:right w:type="dxa" w:w="90"/>
-            </w:tcMar>
-          </w:tcPr>
-          <w:p>
-            <w:r>
-              <w:rPr>
-                <w:color w:val="0F1B14"/>
-                <w:sz w:val="20"/>
-                <w:szCs w:val="20"/>
-              </w:rPr>
-              <w:t xml:space="preserve">Margin bersih penuh (%)</w:t>
-            </w:r>
-          </w:p>
-        </w:tc>
-        <w:tc>
-          <w:tcPr>
-            <w:tcW w:type="pct" w:w="30%"/>
-            <w:tcMar>
-              <w:top w:type="dxa" w:w="60"/>
-              <w:left w:type="dxa" w:w="90"/>
-              <w:bottom w:type="dxa" w:w="60"/>
-              <w:right w:type="dxa" w:w="90"/>
-            </w:tcMar>
-          </w:tcPr>
-          <w:p>
-            <w:r>
-              <w:rPr>
-                <w:color w:val="0F1B14"/>
-                <w:sz w:val="20"/>
-                <w:szCs w:val="20"/>
-              </w:rPr>
-              <w:t xml:space="preserve">netActualProfit ÷ revenueNet × 100</w:t>
-            </w:r>
-          </w:p>
-        </w:tc>
-        <w:tc>
-          <w:tcPr>
-            <w:tcW w:type="pct" w:w="20%"/>
-            <w:tcMar>
-              <w:top w:type="dxa" w:w="60"/>
-              <w:left w:type="dxa" w:w="90"/>
-              <w:bottom w:type="dxa" w:w="60"/>
-              <w:right w:type="dxa" w:w="90"/>
-            </w:tcMar>
-          </w:tcPr>
-          <w:p>
-            <w:r>
-              <w:rPr>
-                <w:color w:val="0F1B14"/>
-                <w:sz w:val="20"/>
-                <w:szCs w:val="20"/>
-              </w:rPr>
-              <w:t xml:space="preserve">81,9%</w:t>
-            </w:r>
-          </w:p>
-        </w:tc>
-      </w:tr>
-    </w:tbl>
-    <w:p>
-      <w:pPr>
-        <w:spacing w:after="120" w:line="276"/>
-      </w:pPr>
-      <w:r>
-        <w:rPr>
-          <w:b/>
-          <w:bCs/>
-          <w:sz w:val="22"/>
-          <w:szCs w:val="22"/>
-        </w:rPr>
-        <w:t xml:space="preserve">Dua jenis margin: </w:t>
-      </w:r>
-      <w:r>
-        <w:rPr>
-          <w:b w:val="false"/>
-          <w:bCs w:val="false"/>
-          <w:sz w:val="22"/>
-          <w:szCs w:val="22"/>
-        </w:rPr>
-        <w:t xml:space="preserve">marginPct (87,0%) adalah pandangan cepat — nilai kontrak kotor dikurangi biaya langsung saja. netMarginPct (81,9%) adalah pandangan realistis — pendapatan bersih (tanpa PPN) dikurangi biaya yang sudah dibebani overhead, sehingga selalu lebih kecil dan lebih jujur untuk pengambilan keputusan.</w:t>
       </w:r>
     </w:p>
     <w:sectPr>

</xml_diff>

<commit_message>
Perbarui dokumen fitur dan perhitungan proyek dalam Bahasa Indonesia
Perbarui dokumen "SecureProfit-Hub-Fitur-dan-Perhitungan.docx" untuk menyelaraskan kontennya dengan versi Bahasa Inggris terbaru, termasuk penambahan detail pada tabel teknologi, gerbang kesiapan, dan bagian EVM serta Health Score.

Replit-Commit-Author: Agent
Replit-Commit-Session-Id: 0226671d-4d7c-40eb-9b18-8775578e8874
Replit-Commit-Checkpoint-Type: full_checkpoint
Replit-Commit-Event-Id: a6ae0173-156a-4bee-98b2-1b9d049c7caa
Replit-Commit-Screenshot-Url: https://storage.googleapis.com/screenshot-production-us-central1/c82b66a8-f4a7-47f1-bdbd-9ebba5cc2312/0226671d-4d7c-40eb-9b18-8775578e8874/ewAacda
Replit-Helium-Checkpoint-Created: true
</commit_message>
<xml_diff>
--- a/exports/SecureProfit-Hub-Fitur-dan-Perhitungan.docx
+++ b/exports/SecureProfit-Hub-Fitur-dan-Perhitungan.docx
@@ -79,7 +79,7 @@
           <w:sz w:val="22"/>
           <w:szCs w:val="22"/>
         </w:rPr>
-        <w:t xml:space="preserve">Disusun: Juni 2026</w:t>
+        <w:t xml:space="preserve">Disusun: Juli 2026 (rev. 2)</w:t>
       </w:r>
     </w:p>
     <w:p>
@@ -927,6 +927,272 @@
           </w:p>
         </w:tc>
       </w:tr>
+      <w:tr>
+        <w:tc>
+          <w:tcPr>
+            <w:tcW w:type="pct" w:w="22%"/>
+            <w:shd w:fill="F1F6F2"/>
+            <w:tcMar>
+              <w:top w:type="dxa" w:w="60"/>
+              <w:left w:type="dxa" w:w="90"/>
+              <w:bottom w:type="dxa" w:w="60"/>
+              <w:right w:type="dxa" w:w="90"/>
+            </w:tcMar>
+          </w:tcPr>
+          <w:p>
+            <w:r>
+              <w:rPr>
+                <w:color w:val="0F1B14"/>
+                <w:sz w:val="20"/>
+                <w:szCs w:val="20"/>
+              </w:rPr>
+              <w:t xml:space="preserve">Impor CRM</w:t>
+            </w:r>
+          </w:p>
+        </w:tc>
+        <w:tc>
+          <w:tcPr>
+            <w:tcW w:type="pct" w:w="40%"/>
+            <w:shd w:fill="F1F6F2"/>
+            <w:tcMar>
+              <w:top w:type="dxa" w:w="60"/>
+              <w:left w:type="dxa" w:w="90"/>
+              <w:bottom w:type="dxa" w:w="60"/>
+              <w:right w:type="dxa" w:w="90"/>
+            </w:tcMar>
+          </w:tcPr>
+          <w:p>
+            <w:r>
+              <w:rPr>
+                <w:color w:val="0F1B14"/>
+                <w:sz w:val="20"/>
+                <w:szCs w:val="20"/>
+              </w:rPr>
+              <w:t xml:space="preserve">Pipedrive API (satu arah)</w:t>
+            </w:r>
+          </w:p>
+        </w:tc>
+        <w:tc>
+          <w:tcPr>
+            <w:tcW w:type="pct" w:w="38%"/>
+            <w:shd w:fill="F1F6F2"/>
+            <w:tcMar>
+              <w:top w:type="dxa" w:w="60"/>
+              <w:left w:type="dxa" w:w="90"/>
+              <w:bottom w:type="dxa" w:w="60"/>
+              <w:right w:type="dxa" w:w="90"/>
+            </w:tcMar>
+          </w:tcPr>
+          <w:p>
+            <w:r>
+              <w:rPr>
+                <w:color w:val="0F1B14"/>
+                <w:sz w:val="20"/>
+                <w:szCs w:val="20"/>
+              </w:rPr>
+              <w:t xml:space="preserve">Mengimpor deal penjualan terbuka ke Sales Pipeline sebagai lead</w:t>
+            </w:r>
+          </w:p>
+        </w:tc>
+      </w:tr>
+      <w:tr>
+        <w:tc>
+          <w:tcPr>
+            <w:tcW w:type="pct" w:w="22%"/>
+            <w:tcMar>
+              <w:top w:type="dxa" w:w="60"/>
+              <w:left w:type="dxa" w:w="90"/>
+              <w:bottom w:type="dxa" w:w="60"/>
+              <w:right w:type="dxa" w:w="90"/>
+            </w:tcMar>
+          </w:tcPr>
+          <w:p>
+            <w:r>
+              <w:rPr>
+                <w:color w:val="0F1B14"/>
+                <w:sz w:val="20"/>
+                <w:szCs w:val="20"/>
+              </w:rPr>
+              <w:t xml:space="preserve">Email</w:t>
+            </w:r>
+          </w:p>
+        </w:tc>
+        <w:tc>
+          <w:tcPr>
+            <w:tcW w:type="pct" w:w="40%"/>
+            <w:tcMar>
+              <w:top w:type="dxa" w:w="60"/>
+              <w:left w:type="dxa" w:w="90"/>
+              <w:bottom w:type="dxa" w:w="60"/>
+              <w:right w:type="dxa" w:w="90"/>
+            </w:tcMar>
+          </w:tcPr>
+          <w:p>
+            <w:r>
+              <w:rPr>
+                <w:color w:val="0F1B14"/>
+                <w:sz w:val="20"/>
+                <w:szCs w:val="20"/>
+              </w:rPr>
+              <w:t xml:space="preserve">Resend (email transaksional)</w:t>
+            </w:r>
+          </w:p>
+        </w:tc>
+        <w:tc>
+          <w:tcPr>
+            <w:tcW w:type="pct" w:w="38%"/>
+            <w:tcMar>
+              <w:top w:type="dxa" w:w="60"/>
+              <w:left w:type="dxa" w:w="90"/>
+              <w:bottom w:type="dxa" w:w="60"/>
+              <w:right w:type="dxa" w:w="90"/>
+            </w:tcMar>
+          </w:tcPr>
+          <w:p>
+            <w:r>
+              <w:rPr>
+                <w:color w:val="0F1B14"/>
+                <w:sz w:val="20"/>
+                <w:szCs w:val="20"/>
+              </w:rPr>
+              <w:t xml:space="preserve">Peringatan email opsional untuk notifikasi penting (saklar global on/off)</w:t>
+            </w:r>
+          </w:p>
+        </w:tc>
+      </w:tr>
+      <w:tr>
+        <w:tc>
+          <w:tcPr>
+            <w:tcW w:type="pct" w:w="22%"/>
+            <w:shd w:fill="F1F6F2"/>
+            <w:tcMar>
+              <w:top w:type="dxa" w:w="60"/>
+              <w:left w:type="dxa" w:w="90"/>
+              <w:bottom w:type="dxa" w:w="60"/>
+              <w:right w:type="dxa" w:w="90"/>
+            </w:tcMar>
+          </w:tcPr>
+          <w:p>
+            <w:r>
+              <w:rPr>
+                <w:color w:val="0F1B14"/>
+                <w:sz w:val="20"/>
+                <w:szCs w:val="20"/>
+              </w:rPr>
+              <w:t xml:space="preserve">Briefing AI</w:t>
+            </w:r>
+          </w:p>
+        </w:tc>
+        <w:tc>
+          <w:tcPr>
+            <w:tcW w:type="pct" w:w="40%"/>
+            <w:shd w:fill="F1F6F2"/>
+            <w:tcMar>
+              <w:top w:type="dxa" w:w="60"/>
+              <w:left w:type="dxa" w:w="90"/>
+              <w:bottom w:type="dxa" w:w="60"/>
+              <w:right w:type="dxa" w:w="90"/>
+            </w:tcMar>
+          </w:tcPr>
+          <w:p>
+            <w:r>
+              <w:rPr>
+                <w:color w:val="0F1B14"/>
+                <w:sz w:val="20"/>
+                <w:szCs w:val="20"/>
+              </w:rPr>
+              <w:t xml:space="preserve">Narasi LLM di atas fakta hasil perhitungan sistem</w:t>
+            </w:r>
+          </w:p>
+        </w:tc>
+        <w:tc>
+          <w:tcPr>
+            <w:tcW w:type="pct" w:w="38%"/>
+            <w:shd w:fill="F1F6F2"/>
+            <w:tcMar>
+              <w:top w:type="dxa" w:w="60"/>
+              <w:left w:type="dxa" w:w="90"/>
+              <w:bottom w:type="dxa" w:w="60"/>
+              <w:right w:type="dxa" w:w="90"/>
+            </w:tcMar>
+          </w:tcPr>
+          <w:p>
+            <w:r>
+              <w:rPr>
+                <w:color w:val="0F1B14"/>
+                <w:sz w:val="20"/>
+                <w:szCs w:val="20"/>
+              </w:rPr>
+              <w:t xml:space="preserve">Halaman AI Executive Copilot untuk Management</w:t>
+            </w:r>
+          </w:p>
+        </w:tc>
+      </w:tr>
+      <w:tr>
+        <w:tc>
+          <w:tcPr>
+            <w:tcW w:type="pct" w:w="22%"/>
+            <w:tcMar>
+              <w:top w:type="dxa" w:w="60"/>
+              <w:left w:type="dxa" w:w="90"/>
+              <w:bottom w:type="dxa" w:w="60"/>
+              <w:right w:type="dxa" w:w="90"/>
+            </w:tcMar>
+          </w:tcPr>
+          <w:p>
+            <w:r>
+              <w:rPr>
+                <w:color w:val="0F1B14"/>
+                <w:sz w:val="20"/>
+                <w:szCs w:val="20"/>
+              </w:rPr>
+              <w:t xml:space="preserve">Aplikasi mobile</w:t>
+            </w:r>
+          </w:p>
+        </w:tc>
+        <w:tc>
+          <w:tcPr>
+            <w:tcW w:type="pct" w:w="40%"/>
+            <w:tcMar>
+              <w:top w:type="dxa" w:w="60"/>
+              <w:left w:type="dxa" w:w="90"/>
+              <w:bottom w:type="dxa" w:w="60"/>
+              <w:right w:type="dxa" w:w="90"/>
+            </w:tcMar>
+          </w:tcPr>
+          <w:p>
+            <w:r>
+              <w:rPr>
+                <w:color w:val="0F1B14"/>
+                <w:sz w:val="20"/>
+                <w:szCs w:val="20"/>
+              </w:rPr>
+              <w:t xml:space="preserve">Expo (React Native)</w:t>
+            </w:r>
+          </w:p>
+        </w:tc>
+        <w:tc>
+          <w:tcPr>
+            <w:tcW w:type="pct" w:w="38%"/>
+            <w:tcMar>
+              <w:top w:type="dxa" w:w="60"/>
+              <w:left w:type="dxa" w:w="90"/>
+              <w:bottom w:type="dxa" w:w="60"/>
+              <w:right w:type="dxa" w:w="90"/>
+            </w:tcMar>
+          </w:tcPr>
+          <w:p>
+            <w:r>
+              <w:rPr>
+                <w:color w:val="0F1B14"/>
+                <w:sz w:val="20"/>
+                <w:szCs w:val="20"/>
+              </w:rPr>
+              <w:t xml:space="preserve">Aplikasi pendamping untuk mencatat waktu &amp; biaya dari ponsel</w:t>
+            </w:r>
+          </w:p>
+        </w:tc>
+      </w:tr>
     </w:tbl>
     <w:p>
       <w:pPr>
@@ -1996,34 +2262,18 @@
     </w:p>
     <w:p>
       <w:pPr>
-        <w:pStyle w:val="Heading1"/>
-        <w:spacing w:after="140" w:before="360"/>
-      </w:pPr>
-      <w:r>
-        <w:rPr>
-          <w:b/>
-          <w:bCs/>
-          <w:color w:val="1F7A4D"/>
-          <w:sz w:val="30"/>
-          <w:szCs w:val="30"/>
-        </w:rPr>
-        <w:t xml:space="preserve">5. Fitur Utama per Modul</w:t>
-      </w:r>
-    </w:p>
-    <w:p>
-      <w:pPr>
-        <w:pStyle w:val="Heading2"/>
-        <w:spacing w:after="90" w:before="220"/>
+        <w:pStyle w:val="Heading3"/>
+        <w:spacing w:after="70" w:before="160"/>
       </w:pPr>
       <w:r>
         <w:rPr>
           <w:b/>
           <w:bCs/>
           <w:color w:val="0F1B14"/>
-          <w:sz w:val="26"/>
-          <w:szCs w:val="26"/>
-        </w:rPr>
-        <w:t xml:space="preserve">5.1 Dashboard per Peran</w:t>
+          <w:sz w:val="23"/>
+          <w:szCs w:val="23"/>
+        </w:rPr>
+        <w:t xml:space="preserve">Gerbang kesiapan (readiness gates) antar status</w:t>
       </w:r>
     </w:p>
     <w:p>
@@ -2035,7 +2285,7 @@
           <w:sz w:val="22"/>
           <w:szCs w:val="22"/>
         </w:rPr>
-        <w:t xml:space="preserve">Setiap peran memperoleh dashboard yang disesuaikan dengan kebutuhannya:</w:t>
+        <w:t xml:space="preserve">Server memberlakukan daftar periksa pada setiap kenaikan status; bila ada yang kurang, perubahan status ditolak disertai daftar jelas apa saja yang harus dilengkapi:</w:t>
       </w:r>
     </w:p>
     <w:p>
@@ -2049,10 +2299,21 @@
       </w:pPr>
       <w:r>
         <w:rPr>
-          <w:sz w:val="22"/>
-          <w:szCs w:val="22"/>
-        </w:rPr>
-        <w:t xml:space="preserve">Management: KPI eksekutif, tren profit, aging penagihan, project berisiko, alokasi PM.</w:t>
+          <w:b/>
+          <w:bCs/>
+          <w:sz w:val="22"/>
+          <w:szCs w:val="22"/>
+        </w:rPr>
+        <w:t xml:space="preserve">Menuju ACTIVE — </w:t>
+      </w:r>
+      <w:r>
+        <w:rPr>
+          <w:b w:val="false"/>
+          <w:bCs w:val="false"/>
+          <w:sz w:val="22"/>
+          <w:szCs w:val="22"/>
+        </w:rPr>
+        <w:t xml:space="preserve">data inti Overview terisi (klien, deskripsi, tanggal, nilai kontrak, manday rencana, estimasi biaya), PM sudah ditetapkan, minimal satu sumber daya, satu tugas, satu item RAID, dan termin penagihan berjumlah total 100%.</w:t>
       </w:r>
     </w:p>
     <w:p>
@@ -2066,10 +2327,21 @@
       </w:pPr>
       <w:r>
         <w:rPr>
-          <w:sz w:val="22"/>
-          <w:szCs w:val="22"/>
-        </w:rPr>
-        <w:t xml:space="preserve">Project Manager: project aktif, kotak persetujuan, utilisasi, revenue vs profit, peringatan, dan kartu My Tasks pribadi.</w:t>
+          <w:b/>
+          <w:bCs/>
+          <w:sz w:val="22"/>
+          <w:szCs w:val="22"/>
+        </w:rPr>
+        <w:t xml:space="preserve">Menuju COMPLETE — </w:t>
+      </w:r>
+      <w:r>
+        <w:rPr>
+          <w:b w:val="false"/>
+          <w:bCs w:val="false"/>
+          <w:sz w:val="22"/>
+          <w:szCs w:val="22"/>
+        </w:rPr>
+        <w:t xml:space="preserve">semua tugas DONE, tidak ada timesheet atau biaya yang masih menunggu persetujuan, tidak ada termin penagihan berstatus PLANNED, tidak ada item RAID yang masih OPEN, dan minimal satu dokumen BAST. Saat COMPLETE, sistem otomatis menerbitkan tautan survei klien dan membuat pasangan umpan balik 360° (PM ↔ setiap anggota tim).</w:t>
       </w:r>
     </w:p>
     <w:p>
@@ -2083,10 +2355,88 @@
       </w:pPr>
       <w:r>
         <w:rPr>
-          <w:sz w:val="22"/>
-          <w:szCs w:val="22"/>
-        </w:rPr>
-        <w:t xml:space="preserve">Sales: pipeline, revenue per klien, tren profitabilitas.</w:t>
+          <w:b/>
+          <w:bCs/>
+          <w:sz w:val="22"/>
+          <w:szCs w:val="22"/>
+        </w:rPr>
+        <w:t xml:space="preserve">Menuju CLOSED — </w:t>
+      </w:r>
+      <w:r>
+        <w:rPr>
+          <w:b w:val="false"/>
+          <w:bCs w:val="false"/>
+          <w:sz w:val="22"/>
+          <w:szCs w:val="22"/>
+        </w:rPr>
+        <w:t xml:space="preserve">seluruh umpan balik 360° sudah dikirim, catatan lessons-learned terisi, dan (untuk project klien) minimal satu respons survei klien. Item daftar periksa penutupan mensyaratkan buktinya sebelum bisa ditandai selesai (BAST bertanda tangan, laporan akhir, invoice terbit).</w:t>
+      </w:r>
+    </w:p>
+    <w:p>
+      <w:pPr>
+        <w:spacing w:after="120" w:line="276"/>
+      </w:pPr>
+      <w:r>
+        <w:rPr>
+          <w:b/>
+          <w:bCs/>
+          <w:sz w:val="22"/>
+          <w:szCs w:val="22"/>
+        </w:rPr>
+        <w:t xml:space="preserve">Catatan: </w:t>
+      </w:r>
+      <w:r>
+        <w:rPr>
+          <w:b w:val="false"/>
+          <w:bCs w:val="false"/>
+          <w:sz w:val="22"/>
+          <w:szCs w:val="22"/>
+        </w:rPr>
+        <w:t xml:space="preserve">project non-klien (Internal / Presales / Training) dikecualikan dari persyaratan penagihan, BAST, dan survei.</w:t>
+      </w:r>
+    </w:p>
+    <w:p>
+      <w:pPr>
+        <w:pStyle w:val="Heading1"/>
+        <w:spacing w:after="140" w:before="360"/>
+      </w:pPr>
+      <w:r>
+        <w:rPr>
+          <w:b/>
+          <w:bCs/>
+          <w:color w:val="1F7A4D"/>
+          <w:sz w:val="30"/>
+          <w:szCs w:val="30"/>
+        </w:rPr>
+        <w:t xml:space="preserve">5. Fitur Utama per Modul</w:t>
+      </w:r>
+    </w:p>
+    <w:p>
+      <w:pPr>
+        <w:pStyle w:val="Heading2"/>
+        <w:spacing w:after="90" w:before="220"/>
+      </w:pPr>
+      <w:r>
+        <w:rPr>
+          <w:b/>
+          <w:bCs/>
+          <w:color w:val="0F1B14"/>
+          <w:sz w:val="26"/>
+          <w:szCs w:val="26"/>
+        </w:rPr>
+        <w:t xml:space="preserve">5.1 Dashboard per Peran</w:t>
+      </w:r>
+    </w:p>
+    <w:p>
+      <w:pPr>
+        <w:spacing w:after="120" w:line="276"/>
+      </w:pPr>
+      <w:r>
+        <w:rPr>
+          <w:sz w:val="22"/>
+          <w:szCs w:val="22"/>
+        </w:rPr>
+        <w:t xml:space="preserve">Setiap peran memperoleh dashboard yang disesuaikan dengan kebutuhannya:</w:t>
       </w:r>
     </w:p>
     <w:p>
@@ -2103,7 +2453,7 @@
           <w:sz w:val="22"/>
           <w:szCs w:val="22"/>
         </w:rPr>
-        <w:t xml:space="preserve">Konsultan/TW: ajakan mencatat waktu, tren, dan daftar tugas saya.</w:t>
+        <w:t xml:space="preserve">Management: KPI eksekutif, tren profit, aging penagihan, project berisiko, alokasi PM.</w:t>
       </w:r>
     </w:p>
     <w:p>
@@ -2120,7 +2470,7 @@
           <w:sz w:val="22"/>
           <w:szCs w:val="22"/>
         </w:rPr>
-        <w:t xml:space="preserve">Admin Project: kotak dokumen penutupan.</w:t>
+        <w:t xml:space="preserve">Project Manager: project aktif, kotak persetujuan, utilisasi, revenue vs profit, peringatan, dan kartu My Tasks pribadi.</w:t>
       </w:r>
     </w:p>
     <w:p>
@@ -2137,35 +2487,7 @@
           <w:sz w:val="22"/>
           <w:szCs w:val="22"/>
         </w:rPr>
-        <w:t xml:space="preserve">HR: headcount, distribusi unit bisnis/peran, cuti, bench, kesenjangan keahlian.</w:t>
-      </w:r>
-    </w:p>
-    <w:p>
-      <w:pPr>
-        <w:pStyle w:val="Heading2"/>
-        <w:spacing w:after="90" w:before="220"/>
-      </w:pPr>
-      <w:r>
-        <w:rPr>
-          <w:b/>
-          <w:bCs/>
-          <w:color w:val="0F1B14"/>
-          <w:sz w:val="26"/>
-          <w:szCs w:val="26"/>
-        </w:rPr>
-        <w:t xml:space="preserve">5.2 Manajemen Project &amp; Tab-tabnya</w:t>
-      </w:r>
-    </w:p>
-    <w:p>
-      <w:pPr>
-        <w:spacing w:after="120" w:line="276"/>
-      </w:pPr>
-      <w:r>
-        <w:rPr>
-          <w:sz w:val="22"/>
-          <w:szCs w:val="22"/>
-        </w:rPr>
-        <w:t xml:space="preserve">Setiap project memiliki halaman detail dengan tab fungsional berikut:</w:t>
+        <w:t xml:space="preserve">Sales: pipeline, revenue per klien, tren profitabilitas.</w:t>
       </w:r>
     </w:p>
     <w:p>
@@ -2179,21 +2501,10 @@
       </w:pPr>
       <w:r>
         <w:rPr>
-          <w:b/>
-          <w:bCs/>
-          <w:sz w:val="22"/>
-          <w:szCs w:val="22"/>
-        </w:rPr>
-        <w:t xml:space="preserve">Overview — </w:t>
-      </w:r>
-      <w:r>
-        <w:rPr>
-          <w:b w:val="false"/>
-          <w:bCs w:val="false"/>
-          <w:sz w:val="22"/>
-          <w:szCs w:val="22"/>
-        </w:rPr>
-        <w:t xml:space="preserve">ringkasan &amp; edit data inti melalui dialog 'Review &amp; Save'.</w:t>
+          <w:sz w:val="22"/>
+          <w:szCs w:val="22"/>
+        </w:rPr>
+        <w:t xml:space="preserve">Konsultan/TW: ajakan mencatat waktu, tren, dan daftar tugas saya.</w:t>
       </w:r>
     </w:p>
     <w:p>
@@ -2207,21 +2518,10 @@
       </w:pPr>
       <w:r>
         <w:rPr>
-          <w:b/>
-          <w:bCs/>
-          <w:sz w:val="22"/>
-          <w:szCs w:val="22"/>
-        </w:rPr>
-        <w:t xml:space="preserve">Timeline (Gantt) — </w:t>
-      </w:r>
-      <w:r>
-        <w:rPr>
-          <w:b w:val="false"/>
-          <w:bCs w:val="false"/>
-          <w:sz w:val="22"/>
-          <w:szCs w:val="22"/>
-        </w:rPr>
-        <w:t xml:space="preserve">penjadwalan tugas dengan drag-and-drop, resize, dan panah dependensi.</w:t>
+          <w:sz w:val="22"/>
+          <w:szCs w:val="22"/>
+        </w:rPr>
+        <w:t xml:space="preserve">Admin Project: kotak dokumen penutupan.</w:t>
       </w:r>
     </w:p>
     <w:p>
@@ -2235,21 +2535,38 @@
       </w:pPr>
       <w:r>
         <w:rPr>
+          <w:sz w:val="22"/>
+          <w:szCs w:val="22"/>
+        </w:rPr>
+        <w:t xml:space="preserve">HR: headcount, distribusi unit bisnis/peran, cuti, bench, kesenjangan keahlian.</w:t>
+      </w:r>
+    </w:p>
+    <w:p>
+      <w:pPr>
+        <w:pStyle w:val="Heading2"/>
+        <w:spacing w:after="90" w:before="220"/>
+      </w:pPr>
+      <w:r>
+        <w:rPr>
           <w:b/>
           <w:bCs/>
-          <w:sz w:val="22"/>
-          <w:szCs w:val="22"/>
-        </w:rPr>
-        <w:t xml:space="preserve">Tasks (WBS) — </w:t>
-      </w:r>
-      <w:r>
-        <w:rPr>
-          <w:b w:val="false"/>
-          <w:bCs w:val="false"/>
-          <w:sz w:val="22"/>
-          <w:szCs w:val="22"/>
-        </w:rPr>
-        <w:t xml:space="preserve">struktur rincian kerja berjenjang, multi-assignee, dependensi finish-to-start, penanda billable.</w:t>
+          <w:color w:val="0F1B14"/>
+          <w:sz w:val="26"/>
+          <w:szCs w:val="26"/>
+        </w:rPr>
+        <w:t xml:space="preserve">5.2 Manajemen Project &amp; Tab-tabnya</w:t>
+      </w:r>
+    </w:p>
+    <w:p>
+      <w:pPr>
+        <w:spacing w:after="120" w:line="276"/>
+      </w:pPr>
+      <w:r>
+        <w:rPr>
+          <w:sz w:val="22"/>
+          <w:szCs w:val="22"/>
+        </w:rPr>
+        <w:t xml:space="preserve">Setiap project memiliki halaman detail dengan tab fungsional berikut:</w:t>
       </w:r>
     </w:p>
     <w:p>
@@ -2268,7 +2585,7 @@
           <w:sz w:val="22"/>
           <w:szCs w:val="22"/>
         </w:rPr>
-        <w:t xml:space="preserve">Resources — </w:t>
+        <w:t xml:space="preserve">Overview — </w:t>
       </w:r>
       <w:r>
         <w:rPr>
@@ -2277,7 +2594,7 @@
           <w:sz w:val="22"/>
           <w:szCs w:val="22"/>
         </w:rPr>
-        <w:t xml:space="preserve">staffing tim Konsultan &amp; Technical Writer, Admin Project, dan sumber daya lain.</w:t>
+        <w:t xml:space="preserve">ringkasan &amp; edit data inti melalui dialog 'Review &amp; Save'.</w:t>
       </w:r>
     </w:p>
     <w:p>
@@ -2296,7 +2613,7 @@
           <w:sz w:val="22"/>
           <w:szCs w:val="22"/>
         </w:rPr>
-        <w:t xml:space="preserve">RAID — </w:t>
+        <w:t xml:space="preserve">Timeline (Gantt) — </w:t>
       </w:r>
       <w:r>
         <w:rPr>
@@ -2305,7 +2622,7 @@
           <w:sz w:val="22"/>
           <w:szCs w:val="22"/>
         </w:rPr>
-        <w:t xml:space="preserve">registrasi Risk, Assumption, Issue, Dependency (khusus tim delivery).</w:t>
+        <w:t xml:space="preserve">penjadwalan tugas dengan drag-and-drop, resize, dan panah dependensi.</w:t>
       </w:r>
     </w:p>
     <w:p>
@@ -2324,7 +2641,7 @@
           <w:sz w:val="22"/>
           <w:szCs w:val="22"/>
         </w:rPr>
-        <w:t xml:space="preserve">Expenses — </w:t>
+        <w:t xml:space="preserve">Tasks (WBS) — </w:t>
       </w:r>
       <w:r>
         <w:rPr>
@@ -2333,7 +2650,7 @@
           <w:sz w:val="22"/>
           <w:szCs w:val="22"/>
         </w:rPr>
-        <w:t xml:space="preserve">biaya non-sumber daya dengan alur persetujuan; hanya yang APPROVED menambah biaya aktual.</w:t>
+        <w:t xml:space="preserve">struktur rincian kerja berjenjang, multi-assignee, dependensi finish-to-start, penanda billable, dan batas jam rencana (planned-hours cap) opsional per tugas (pencatatan melebihi batas akan ditolak).</w:t>
       </w:r>
     </w:p>
     <w:p>
@@ -2352,7 +2669,7 @@
           <w:sz w:val="22"/>
           <w:szCs w:val="22"/>
         </w:rPr>
-        <w:t xml:space="preserve">Timesheets — </w:t>
+        <w:t xml:space="preserve">Resources — </w:t>
       </w:r>
       <w:r>
         <w:rPr>
@@ -2361,7 +2678,7 @@
           <w:sz w:val="22"/>
           <w:szCs w:val="22"/>
         </w:rPr>
-        <w:t xml:space="preserve">seluruh entri waktu pada project, dengan KPI dan persetujuan massal.</w:t>
+        <w:t xml:space="preserve">staffing tim Konsultan &amp; Technical Writer, Admin Project, dan sumber daya lain.</w:t>
       </w:r>
     </w:p>
     <w:p>
@@ -2380,7 +2697,7 @@
           <w:sz w:val="22"/>
           <w:szCs w:val="22"/>
         </w:rPr>
-        <w:t xml:space="preserve">Billing — </w:t>
+        <w:t xml:space="preserve">RAID — </w:t>
       </w:r>
       <w:r>
         <w:rPr>
@@ -2389,7 +2706,7 @@
           <w:sz w:val="22"/>
           <w:szCs w:val="22"/>
         </w:rPr>
-        <w:t xml:space="preserve">Termin pembayaran (milestone) dengan %, DPP, PPN, total, jatuh tempo, dan status invoice.</w:t>
+        <w:t xml:space="preserve">registrasi Risk, Assumption, Issue, Dependency (khusus tim delivery).</w:t>
       </w:r>
     </w:p>
     <w:p>
@@ -2408,7 +2725,7 @@
           <w:sz w:val="22"/>
           <w:szCs w:val="22"/>
         </w:rPr>
-        <w:t xml:space="preserve">Financials — </w:t>
+        <w:t xml:space="preserve">Expenses — </w:t>
       </w:r>
       <w:r>
         <w:rPr>
@@ -2417,7 +2734,119 @@
           <w:sz w:val="22"/>
           <w:szCs w:val="22"/>
         </w:rPr>
-        <w:t xml:space="preserve">biaya, profit, margin, burn rate, dan proyeksi (forecast).</w:t>
+        <w:t xml:space="preserve">biaya non-sumber daya dengan alur persetujuan; hanya yang APPROVED menambah biaya aktual.</w:t>
+      </w:r>
+    </w:p>
+    <w:p>
+      <w:pPr>
+        <w:pStyle w:val="ListParagraph"/>
+        <w:numPr>
+          <w:ilvl w:val="0"/>
+          <w:numId w:val="1"/>
+        </w:numPr>
+        <w:spacing w:after="60" w:line="268"/>
+      </w:pPr>
+      <w:r>
+        <w:rPr>
+          <w:b/>
+          <w:bCs/>
+          <w:sz w:val="22"/>
+          <w:szCs w:val="22"/>
+        </w:rPr>
+        <w:t xml:space="preserve">Timesheets — </w:t>
+      </w:r>
+      <w:r>
+        <w:rPr>
+          <w:b w:val="false"/>
+          <w:bCs w:val="false"/>
+          <w:sz w:val="22"/>
+          <w:szCs w:val="22"/>
+        </w:rPr>
+        <w:t xml:space="preserve">seluruh entri waktu pada project, dengan KPI dan persetujuan massal.</w:t>
+      </w:r>
+    </w:p>
+    <w:p>
+      <w:pPr>
+        <w:pStyle w:val="ListParagraph"/>
+        <w:numPr>
+          <w:ilvl w:val="0"/>
+          <w:numId w:val="1"/>
+        </w:numPr>
+        <w:spacing w:after="60" w:line="268"/>
+      </w:pPr>
+      <w:r>
+        <w:rPr>
+          <w:b/>
+          <w:bCs/>
+          <w:sz w:val="22"/>
+          <w:szCs w:val="22"/>
+        </w:rPr>
+        <w:t xml:space="preserve">Billing — </w:t>
+      </w:r>
+      <w:r>
+        <w:rPr>
+          <w:b w:val="false"/>
+          <w:bCs w:val="false"/>
+          <w:sz w:val="22"/>
+          <w:szCs w:val="22"/>
+        </w:rPr>
+        <w:t xml:space="preserve">Termin pembayaran (milestone) dengan %, DPP, PPN, total, jatuh tempo, dan status invoice.</w:t>
+      </w:r>
+    </w:p>
+    <w:p>
+      <w:pPr>
+        <w:pStyle w:val="ListParagraph"/>
+        <w:numPr>
+          <w:ilvl w:val="0"/>
+          <w:numId w:val="1"/>
+        </w:numPr>
+        <w:spacing w:after="60" w:line="268"/>
+      </w:pPr>
+      <w:r>
+        <w:rPr>
+          <w:b/>
+          <w:bCs/>
+          <w:sz w:val="22"/>
+          <w:szCs w:val="22"/>
+        </w:rPr>
+        <w:t xml:space="preserve">Financials — </w:t>
+      </w:r>
+      <w:r>
+        <w:rPr>
+          <w:b w:val="false"/>
+          <w:bCs w:val="false"/>
+          <w:sz w:val="22"/>
+          <w:szCs w:val="22"/>
+        </w:rPr>
+        <w:t xml:space="preserve">biaya, profit, margin, burn rate, forecast, Profit Outlook, Health Score project, dan indikator Earned Value (EVM) terhadap baseline project.</w:t>
+      </w:r>
+    </w:p>
+    <w:p>
+      <w:pPr>
+        <w:pStyle w:val="ListParagraph"/>
+        <w:numPr>
+          <w:ilvl w:val="0"/>
+          <w:numId w:val="1"/>
+        </w:numPr>
+        <w:spacing w:after="60" w:line="268"/>
+      </w:pPr>
+      <w:r>
+        <w:rPr>
+          <w:b/>
+          <w:bCs/>
+          <w:sz w:val="22"/>
+          <w:szCs w:val="22"/>
+        </w:rPr>
+        <w:t xml:space="preserve">Change Requests — </w:t>
+      </w:r>
+      <w:r>
+        <w:rPr>
+          <w:b w:val="false"/>
+          <w:bCs w:val="false"/>
+          <w:sz w:val="22"/>
+          <w:szCs w:val="22"/>
+        </w:rPr>
+        <w:t xml:space="preserve">perubahan formal lingkup/jadwal/biaya dengan alur DRAFT → APPROVED → APPLIED; penerapan perubahan jadwal atau biaya memperbarui project dan mencatat baseline baru.</w:t>
       </w:r>
     </w:p>
     <w:p>
@@ -3001,7 +3430,7 @@
                 <w:sz w:val="20"/>
                 <w:szCs w:val="20"/>
               </w:rPr>
-              <w:t xml:space="preserve">Task Templates</w:t>
+              <w:t xml:space="preserve">Task &amp; Project Templates</w:t>
             </w:r>
           </w:p>
         </w:tc>
@@ -3022,7 +3451,367 @@
                 <w:sz w:val="20"/>
                 <w:szCs w:val="20"/>
               </w:rPr>
-              <w:t xml:space="preserve">Template WBS yang dapat diterapkan ke project baru.</w:t>
+              <w:t xml:space="preserve">Template WBS dan template project yang dapat diterapkan ke project baru.</w:t>
+            </w:r>
+          </w:p>
+        </w:tc>
+      </w:tr>
+      <w:tr>
+        <w:tc>
+          <w:tcPr>
+            <w:tcW w:type="pct" w:w="34%"/>
+            <w:shd w:fill="F1F6F2"/>
+            <w:tcMar>
+              <w:top w:type="dxa" w:w="60"/>
+              <w:left w:type="dxa" w:w="90"/>
+              <w:bottom w:type="dxa" w:w="60"/>
+              <w:right w:type="dxa" w:w="90"/>
+            </w:tcMar>
+          </w:tcPr>
+          <w:p>
+            <w:r>
+              <w:rPr>
+                <w:color w:val="0F1B14"/>
+                <w:sz w:val="20"/>
+                <w:szCs w:val="20"/>
+              </w:rPr>
+              <w:t xml:space="preserve">Sales Pipeline (Leads)</w:t>
+            </w:r>
+          </w:p>
+        </w:tc>
+        <w:tc>
+          <w:tcPr>
+            <w:tcW w:type="pct" w:w="66%"/>
+            <w:shd w:fill="F1F6F2"/>
+            <w:tcMar>
+              <w:top w:type="dxa" w:w="60"/>
+              <w:left w:type="dxa" w:w="90"/>
+              <w:bottom w:type="dxa" w:w="60"/>
+              <w:right w:type="dxa" w:w="90"/>
+            </w:tcMar>
+          </w:tcPr>
+          <w:p>
+            <w:r>
+              <w:rPr>
+                <w:color w:val="0F1B14"/>
+                <w:sz w:val="20"/>
+                <w:szCs w:val="20"/>
+              </w:rPr>
+              <w:t xml:space="preserve">Kanban lead dari kontak pertama hingga konversi menjadi project; deal terbuka dapat diimpor satu arah dari Pipedrive CRM.</w:t>
+            </w:r>
+          </w:p>
+        </w:tc>
+      </w:tr>
+      <w:tr>
+        <w:tc>
+          <w:tcPr>
+            <w:tcW w:type="pct" w:w="34%"/>
+            <w:tcMar>
+              <w:top w:type="dxa" w:w="60"/>
+              <w:left w:type="dxa" w:w="90"/>
+              <w:bottom w:type="dxa" w:w="60"/>
+              <w:right w:type="dxa" w:w="90"/>
+            </w:tcMar>
+          </w:tcPr>
+          <w:p>
+            <w:r>
+              <w:rPr>
+                <w:color w:val="0F1B14"/>
+                <w:sz w:val="20"/>
+                <w:szCs w:val="20"/>
+              </w:rPr>
+              <w:t xml:space="preserve">AI Executive Copilot</w:t>
+            </w:r>
+          </w:p>
+        </w:tc>
+        <w:tc>
+          <w:tcPr>
+            <w:tcW w:type="pct" w:w="66%"/>
+            <w:tcMar>
+              <w:top w:type="dxa" w:w="60"/>
+              <w:left w:type="dxa" w:w="90"/>
+              <w:bottom w:type="dxa" w:w="60"/>
+              <w:right w:type="dxa" w:w="90"/>
+            </w:tcMar>
+          </w:tcPr>
+          <w:p>
+            <w:r>
+              <w:rPr>
+                <w:color w:val="0F1B14"/>
+                <w:sz w:val="20"/>
+                <w:szCs w:val="20"/>
+              </w:rPr>
+              <w:t xml:space="preserve">Briefing AI khusus Management: kesehatan portofolio, sorotan risiko, dan Top 5 aksi. Angka dihitung sistem; AI hanya menarasikan.</w:t>
+            </w:r>
+          </w:p>
+        </w:tc>
+      </w:tr>
+      <w:tr>
+        <w:tc>
+          <w:tcPr>
+            <w:tcW w:type="pct" w:w="34%"/>
+            <w:shd w:fill="F1F6F2"/>
+            <w:tcMar>
+              <w:top w:type="dxa" w:w="60"/>
+              <w:left w:type="dxa" w:w="90"/>
+              <w:bottom w:type="dxa" w:w="60"/>
+              <w:right w:type="dxa" w:w="90"/>
+            </w:tcMar>
+          </w:tcPr>
+          <w:p>
+            <w:r>
+              <w:rPr>
+                <w:color w:val="0F1B14"/>
+                <w:sz w:val="20"/>
+                <w:szCs w:val="20"/>
+              </w:rPr>
+              <w:t xml:space="preserve">Portfolio Monitor &amp; PM Dashboards</w:t>
+            </w:r>
+          </w:p>
+        </w:tc>
+        <w:tc>
+          <w:tcPr>
+            <w:tcW w:type="pct" w:w="66%"/>
+            <w:shd w:fill="F1F6F2"/>
+            <w:tcMar>
+              <w:top w:type="dxa" w:w="60"/>
+              <w:left w:type="dxa" w:w="90"/>
+              <w:bottom w:type="dxa" w:w="60"/>
+              <w:right w:type="dxa" w:w="90"/>
+            </w:tcMar>
+          </w:tcPr>
+          <w:p>
+            <w:r>
+              <w:rPr>
+                <w:color w:val="0F1B14"/>
+                <w:sz w:val="20"/>
+                <w:szCs w:val="20"/>
+              </w:rPr>
+              <w:t xml:space="preserve">Pemantauan read-only seluruh project komersial se-PMO, plus tampilan portofolio per PM.</w:t>
+            </w:r>
+          </w:p>
+        </w:tc>
+      </w:tr>
+      <w:tr>
+        <w:tc>
+          <w:tcPr>
+            <w:tcW w:type="pct" w:w="34%"/>
+            <w:tcMar>
+              <w:top w:type="dxa" w:w="60"/>
+              <w:left w:type="dxa" w:w="90"/>
+              <w:bottom w:type="dxa" w:w="60"/>
+              <w:right w:type="dxa" w:w="90"/>
+            </w:tcMar>
+          </w:tcPr>
+          <w:p>
+            <w:r>
+              <w:rPr>
+                <w:color w:val="0F1B14"/>
+                <w:sz w:val="20"/>
+                <w:szCs w:val="20"/>
+              </w:rPr>
+              <w:t xml:space="preserve">Business Intelligence &amp; Top Performers</w:t>
+            </w:r>
+          </w:p>
+        </w:tc>
+        <w:tc>
+          <w:tcPr>
+            <w:tcW w:type="pct" w:w="66%"/>
+            <w:tcMar>
+              <w:top w:type="dxa" w:w="60"/>
+              <w:left w:type="dxa" w:w="90"/>
+              <w:bottom w:type="dxa" w:w="60"/>
+              <w:right w:type="dxa" w:w="90"/>
+            </w:tcMar>
+          </w:tcPr>
+          <w:p>
+            <w:r>
+              <w:rPr>
+                <w:color w:val="0F1B14"/>
+                <w:sz w:val="20"/>
+                <w:szCs w:val="20"/>
+              </w:rPr>
+              <w:t xml:space="preserve">Analitik manajemen lanjutan dan peringkat anggota tim berkinerja terbaik.</w:t>
+            </w:r>
+          </w:p>
+        </w:tc>
+      </w:tr>
+      <w:tr>
+        <w:tc>
+          <w:tcPr>
+            <w:tcW w:type="pct" w:w="34%"/>
+            <w:shd w:fill="F1F6F2"/>
+            <w:tcMar>
+              <w:top w:type="dxa" w:w="60"/>
+              <w:left w:type="dxa" w:w="90"/>
+              <w:bottom w:type="dxa" w:w="60"/>
+              <w:right w:type="dxa" w:w="90"/>
+            </w:tcMar>
+          </w:tcPr>
+          <w:p>
+            <w:r>
+              <w:rPr>
+                <w:color w:val="0F1B14"/>
+                <w:sz w:val="20"/>
+                <w:szCs w:val="20"/>
+              </w:rPr>
+              <w:t xml:space="preserve">Work Hours</w:t>
+            </w:r>
+          </w:p>
+        </w:tc>
+        <w:tc>
+          <w:tcPr>
+            <w:tcW w:type="pct" w:w="66%"/>
+            <w:shd w:fill="F1F6F2"/>
+            <w:tcMar>
+              <w:top w:type="dxa" w:w="60"/>
+              <w:left w:type="dxa" w:w="90"/>
+              <w:bottom w:type="dxa" w:w="60"/>
+              <w:right w:type="dxa" w:w="90"/>
+            </w:tcMar>
+          </w:tcPr>
+          <w:p>
+            <w:r>
+              <w:rPr>
+                <w:color w:val="0F1B14"/>
+                <w:sz w:val="20"/>
+                <w:szCs w:val="20"/>
+              </w:rPr>
+              <w:t xml:space="preserve">Pemantauan kepatuhan 40 jam per minggu; cuti yang disetujui menurunkan target mingguan.</w:t>
+            </w:r>
+          </w:p>
+        </w:tc>
+      </w:tr>
+      <w:tr>
+        <w:tc>
+          <w:tcPr>
+            <w:tcW w:type="pct" w:w="34%"/>
+            <w:tcMar>
+              <w:top w:type="dxa" w:w="60"/>
+              <w:left w:type="dxa" w:w="90"/>
+              <w:bottom w:type="dxa" w:w="60"/>
+              <w:right w:type="dxa" w:w="90"/>
+            </w:tcMar>
+          </w:tcPr>
+          <w:p>
+            <w:r>
+              <w:rPr>
+                <w:color w:val="0F1B14"/>
+                <w:sz w:val="20"/>
+                <w:szCs w:val="20"/>
+              </w:rPr>
+              <w:t xml:space="preserve">Survey Results &amp; Template</w:t>
+            </w:r>
+          </w:p>
+        </w:tc>
+        <w:tc>
+          <w:tcPr>
+            <w:tcW w:type="pct" w:w="66%"/>
+            <w:tcMar>
+              <w:top w:type="dxa" w:w="60"/>
+              <w:left w:type="dxa" w:w="90"/>
+              <w:bottom w:type="dxa" w:w="60"/>
+              <w:right w:type="dxa" w:w="90"/>
+            </w:tcMar>
+          </w:tcPr>
+          <w:p>
+            <w:r>
+              <w:rPr>
+                <w:color w:val="0F1B14"/>
+                <w:sz w:val="20"/>
+                <w:szCs w:val="20"/>
+              </w:rPr>
+              <w:t xml:space="preserve">Hasil survei kepuasan klien (CSAT) dan template pertanyaan yang dapat diedit.</w:t>
+            </w:r>
+          </w:p>
+        </w:tc>
+      </w:tr>
+      <w:tr>
+        <w:tc>
+          <w:tcPr>
+            <w:tcW w:type="pct" w:w="34%"/>
+            <w:shd w:fill="F1F6F2"/>
+            <w:tcMar>
+              <w:top w:type="dxa" w:w="60"/>
+              <w:left w:type="dxa" w:w="90"/>
+              <w:bottom w:type="dxa" w:w="60"/>
+              <w:right w:type="dxa" w:w="90"/>
+            </w:tcMar>
+          </w:tcPr>
+          <w:p>
+            <w:r>
+              <w:rPr>
+                <w:color w:val="0F1B14"/>
+                <w:sz w:val="20"/>
+                <w:szCs w:val="20"/>
+              </w:rPr>
+              <w:t xml:space="preserve">Notifications</w:t>
+            </w:r>
+          </w:p>
+        </w:tc>
+        <w:tc>
+          <w:tcPr>
+            <w:tcW w:type="pct" w:w="66%"/>
+            <w:shd w:fill="F1F6F2"/>
+            <w:tcMar>
+              <w:top w:type="dxa" w:w="60"/>
+              <w:left w:type="dxa" w:w="90"/>
+              <w:bottom w:type="dxa" w:w="60"/>
+              <w:right w:type="dxa" w:w="90"/>
+            </w:tcMar>
+          </w:tcPr>
+          <w:p>
+            <w:r>
+              <w:rPr>
+                <w:color w:val="0F1B14"/>
+                <w:sz w:val="20"/>
+                <w:szCs w:val="20"/>
+              </w:rPr>
+              <w:t xml:space="preserve">Lonceng notifikasi dalam aplikasi untuk semua peran; kejadian penting juga dapat dikirim via email (saklar global diatur Management).</w:t>
+            </w:r>
+          </w:p>
+        </w:tc>
+      </w:tr>
+      <w:tr>
+        <w:tc>
+          <w:tcPr>
+            <w:tcW w:type="pct" w:w="34%"/>
+            <w:tcMar>
+              <w:top w:type="dxa" w:w="60"/>
+              <w:left w:type="dxa" w:w="90"/>
+              <w:bottom w:type="dxa" w:w="60"/>
+              <w:right w:type="dxa" w:w="90"/>
+            </w:tcMar>
+          </w:tcPr>
+          <w:p>
+            <w:r>
+              <w:rPr>
+                <w:color w:val="0F1B14"/>
+                <w:sz w:val="20"/>
+                <w:szCs w:val="20"/>
+              </w:rPr>
+              <w:t xml:space="preserve">Aplikasi Mobile</w:t>
+            </w:r>
+          </w:p>
+        </w:tc>
+        <w:tc>
+          <w:tcPr>
+            <w:tcW w:type="pct" w:w="66%"/>
+            <w:tcMar>
+              <w:top w:type="dxa" w:w="60"/>
+              <w:left w:type="dxa" w:w="90"/>
+              <w:bottom w:type="dxa" w:w="60"/>
+              <w:right w:type="dxa" w:w="90"/>
+            </w:tcMar>
+          </w:tcPr>
+          <w:p>
+            <w:r>
+              <w:rPr>
+                <w:color w:val="0F1B14"/>
+                <w:sz w:val="20"/>
+                <w:szCs w:val="20"/>
+              </w:rPr>
+              <w:t xml:space="preserve">Aplikasi pendamping berbasis Expo untuk konsultan: catat timesheet dan biaya dari ponsel.</w:t>
             </w:r>
           </w:p>
         </w:tc>
@@ -3145,7 +3934,7 @@
           <w:sz w:val="22"/>
           <w:szCs w:val="22"/>
         </w:rPr>
-        <w:t xml:space="preserve">tarif yang dipakai adalah tarif pada penugasan project (ProjectResource); jika tidak ada, jatuh ke tarif harian default pengguna.</w:t>
+        <w:t xml:space="preserve">setiap penugasan project menyimpan riwayat tarif (periode tarif dengan tanggal mulai berlaku). Timesheet dihitung memakai tarif yang berlaku pada tanggal kerjanya, sehingga perubahan tarif di tengah project tidak pernah mengubah harga pekerjaan yang sudah lewat. Bila belum ada periode tarif, tarif harian penugasan yang dipakai.</w:t>
       </w:r>
     </w:p>
     <w:p>
@@ -3196,6 +3985,29 @@
     </w:p>
     <w:p>
       <w:pPr>
+        <w:spacing w:after="120" w:line="276"/>
+      </w:pPr>
+      <w:r>
+        <w:rPr>
+          <w:b/>
+          <w:bCs/>
+          <w:sz w:val="22"/>
+          <w:szCs w:val="22"/>
+        </w:rPr>
+        <w:t xml:space="preserve">Kas bon (cash advance): </w:t>
+      </w:r>
+      <w:r>
+        <w:rPr>
+          <w:b w:val="false"/>
+          <w:bCs w:val="false"/>
+          <w:sz w:val="22"/>
+          <w:szCs w:val="22"/>
+        </w:rPr>
+        <w:t xml:space="preserve">biaya kas bon nantinya diselesaikan (settle) terhadap bukti pengeluaran aktual; setelah diselesaikan, nilai settlement (bukan nilai kas bon awal) yang dihitung sebagai biaya. Biaya purchase order menyertakan nomor PO.</w:t>
+      </w:r>
+    </w:p>
+    <w:p>
+      <w:pPr>
         <w:pStyle w:val="Heading2"/>
         <w:spacing w:after="90" w:before="220"/>
       </w:pPr>
@@ -3744,7 +4556,7 @@
           <w:sz w:val="26"/>
           <w:szCs w:val="26"/>
         </w:rPr>
-        <w:t xml:space="preserve">6.10 Proyeksi Biaya (Forecast)</w:t>
+        <w:t xml:space="preserve">6.10 Proyeksi Biaya (Forecast) &amp; Profit Outlook</w:t>
       </w:r>
     </w:p>
     <w:p>
@@ -3756,7 +4568,49 @@
           <w:sz w:val="22"/>
           <w:szCs w:val="22"/>
         </w:rPr>
-        <w:t xml:space="preserve">Forecast memproyeksikan biaya akhir secara linear berdasarkan laju pembakaran (burn rate) saat ini. Endpoint finansial mengagregasi timesheet yang disetujui per bulan dan membandingkannya dengan nilai kontrak yang disebar di sepanjang bulan-bulan aktif project.</w:t>
+        <w:t xml:space="preserve">Satu mesin burn-rate memproyeksikan biaya akhir dari laju pekerjaan yang sudah disetujui: sistem menghitung rata-rata biaya per manday lalu memperluasnya ke total manday rencana. Bila belum ada pekerjaan yang disetujui, forecast memakai estimasi intake sebagai cadangan sehingga angka tidak pernah kosong pada project yang masih muda.</w:t>
+      </w:r>
+    </w:p>
+    <w:p>
+      <w:pPr>
+        <w:pBdr>
+          <w:left w:val="single" w:color="1F7A4D" w:sz="18" w:space="8"/>
+        </w:pBdr>
+        <w:shd w:fill="F1F6F2"/>
+        <w:spacing w:after="120" w:before="60"/>
+      </w:pPr>
+      <w:r>
+        <w:rPr>
+          <w:rFonts w:ascii="Consolas" w:cs="Consolas" w:eastAsia="Consolas" w:hAnsi="Consolas"/>
+          <w:color w:val="0F1B14"/>
+          <w:sz w:val="21"/>
+          <w:szCs w:val="21"/>
+        </w:rPr>
+        <w:t xml:space="preserve">forecastFinalCost = plannedMandays × avgCostPerManday + approvedExpenses
+(cadangan: estimasi biaya intake bila belum ada pekerjaan disetujui)</w:t>
+      </w:r>
+    </w:p>
+    <w:p>
+      <w:pPr>
+        <w:spacing w:after="120" w:line="276"/>
+      </w:pPr>
+      <w:r>
+        <w:rPr>
+          <w:b/>
+          <w:bCs/>
+          <w:sz w:val="22"/>
+          <w:szCs w:val="22"/>
+        </w:rPr>
+        <w:t xml:space="preserve">Profit Outlook: </w:t>
+      </w:r>
+      <w:r>
+        <w:rPr>
+          <w:b w:val="false"/>
+          <w:bCs w:val="false"/>
+          <w:sz w:val="22"/>
+          <w:szCs w:val="22"/>
+        </w:rPr>
+        <w:t xml:space="preserve">tab Financials menampilkan tiga angka berdampingan — Estimasi Awal (dari intake), Aktual sejauh ini, dan Proyeksi saat selesai — dengan penanda status EARLY, PROFIT, THIN, atau LOSS RISK. Margin/Health membaca aktual-sejauh-ini sementara Outlook memproyeksikan hingga selesai, sehingga project muda bisa sah menampilkan margin tinggi sekaligus proyeksi rugi pada saat yang sama.</w:t>
       </w:r>
     </w:p>
     <w:p>
@@ -3813,6 +4667,82 @@
           <w:szCs w:val="22"/>
         </w:rPr>
         <w:t xml:space="preserve">Perencanaan sumber daya menampilkan beban manday per minggu per orang/unit bisnis, dengan memperhitungkan cuti (UserLeave). Ini dipakai untuk memantau utilisasi konsultan dan mengidentifikasi bench (kapasitas menganggur).</w:t>
+      </w:r>
+    </w:p>
+    <w:p>
+      <w:pPr>
+        <w:pStyle w:val="Heading2"/>
+        <w:spacing w:after="90" w:before="220"/>
+      </w:pPr>
+      <w:r>
+        <w:rPr>
+          <w:b/>
+          <w:bCs/>
+          <w:color w:val="0F1B14"/>
+          <w:sz w:val="26"/>
+          <w:szCs w:val="26"/>
+        </w:rPr>
+        <w:t xml:space="preserve">6.13 Earned Value (EVM) &amp; Baseline</w:t>
+      </w:r>
+    </w:p>
+    <w:p>
+      <w:pPr>
+        <w:spacing w:after="120" w:line="276"/>
+      </w:pPr>
+      <w:r>
+        <w:rPr>
+          <w:sz w:val="22"/>
+          <w:szCs w:val="22"/>
+        </w:rPr>
+        <w:t xml:space="preserve">Saat project diaktifkan, sistem merekam baseline (tanggal rencana, nilai, manday). Change request yang disetujui mencatat versi baseline baru. Terhadap baseline yang berlaku, aplikasi menghitung indikator earned-value standar:</w:t>
+      </w:r>
+    </w:p>
+    <w:p>
+      <w:pPr>
+        <w:pBdr>
+          <w:left w:val="single" w:color="1F7A4D" w:sz="18" w:space="8"/>
+        </w:pBdr>
+        <w:shd w:fill="F1F6F2"/>
+        <w:spacing w:after="120" w:before="60"/>
+      </w:pPr>
+      <w:r>
+        <w:rPr>
+          <w:rFonts w:ascii="Consolas" w:cs="Consolas" w:eastAsia="Consolas" w:hAnsi="Consolas"/>
+          <w:color w:val="0F1B14"/>
+          <w:sz w:val="21"/>
+          <w:szCs w:val="21"/>
+        </w:rPr>
+        <w:t xml:space="preserve">CPI = earned value ÷ actual cost      (&gt;1 = di bawah anggaran)
+SPI = earned value ÷ planned value    (&gt;1 = lebih cepat dari jadwal)
+EAC = proyeksi total biaya saat selesai</w:t>
+      </w:r>
+    </w:p>
+    <w:p>
+      <w:pPr>
+        <w:pStyle w:val="Heading2"/>
+        <w:spacing w:after="90" w:before="220"/>
+      </w:pPr>
+      <w:r>
+        <w:rPr>
+          <w:b/>
+          <w:bCs/>
+          <w:color w:val="0F1B14"/>
+          <w:sz w:val="26"/>
+          <w:szCs w:val="26"/>
+        </w:rPr>
+        <w:t xml:space="preserve">6.14 Skor Kesehatan Project (Health Score)</w:t>
+      </w:r>
+    </w:p>
+    <w:p>
+      <w:pPr>
+        <w:spacing w:after="120" w:line="276"/>
+      </w:pPr>
+      <w:r>
+        <w:rPr>
+          <w:sz w:val="22"/>
+          <w:szCs w:val="22"/>
+        </w:rPr>
+        <w:t xml:space="preserve">Setiap project berjalan mendapat skor kesehatan 0-100 yang dibangun dari lima komponen berbobot: erosi margin terhadap estimasi awal, item RAID terbuka berbobot dampak, biaya yang menunggu persetujuan, termin penagihan lewat jatuh tempo, dan hari lewat dari tanggal akhir rencana. Skor ditahan (tidak ditampilkan) selama project masih DRAFT/OBSERVATION atau sudah CLOSED. Skor ini menjadi dasar daftar project berisiko di dashboard Management, PM Dashboards, dan Portfolio Monitor.</w:t>
       </w:r>
     </w:p>
     <w:p>

</xml_diff>